<commit_message>
added document for better visualisation of the raw results of the usertesting
</commit_message>
<xml_diff>
--- a/Open_Question_Answers.docx
+++ b/Open_Question_Answers.docx
@@ -2,6 +2,1360 @@
 <file path=word/document.xml><?xml version="1.0" encoding="utf-8"?>
 <w:document xmlns:wpc="http://schemas.microsoft.com/office/word/2010/wordprocessingCanvas" xmlns:cx="http://schemas.microsoft.com/office/drawing/2014/chartex" xmlns:cx1="http://schemas.microsoft.com/office/drawing/2015/9/8/chartex" xmlns:cx2="http://schemas.microsoft.com/office/drawing/2015/10/21/chartex" xmlns:cx3="http://schemas.microsoft.com/office/drawing/2016/5/9/chartex" xmlns:cx4="http://schemas.microsoft.com/office/drawing/2016/5/10/chartex" xmlns:cx5="http://schemas.microsoft.com/office/drawing/2016/5/11/chartex" xmlns:cx6="http://schemas.microsoft.com/office/drawing/2016/5/12/chartex" xmlns:cx7="http://schemas.microsoft.com/office/drawing/2016/5/13/chartex" xmlns:cx8="http://schemas.microsoft.com/office/drawing/2016/5/14/chartex" xmlns:mc="http://schemas.openxmlformats.org/markup-compatibility/2006" xmlns:aink="http://schemas.microsoft.com/office/drawing/2016/ink" xmlns:am3d="http://schemas.microsoft.com/office/drawing/2017/model3d" xmlns:o="urn:schemas-microsoft-com:office:office" xmlns:oel="http://schemas.microsoft.com/office/2019/extlst" xmlns:r="http://schemas.openxmlformats.org/officeDocument/2006/relationships" xmlns:m="http://schemas.openxmlformats.org/officeDocument/2006/math" xmlns:v="urn:schemas-microsoft-com:vml" xmlns:wp14="http://schemas.microsoft.com/office/word/2010/wordprocessingDrawing" xmlns:wp="http://schemas.openxmlformats.org/drawingml/2006/wordprocessingDrawing" xmlns:w10="urn:schemas-microsoft-com:office:word" xmlns:w="http://schemas.openxmlformats.org/wordprocessingml/2006/main" xmlns:w14="http://schemas.microsoft.com/office/word/2010/wordml" xmlns:w15="http://schemas.microsoft.com/office/word/2012/wordml" xmlns:w16cex="http://schemas.microsoft.com/office/word/2018/wordml/cex" xmlns:w16cid="http://schemas.microsoft.com/office/word/2016/wordml/cid" xmlns:w16="http://schemas.microsoft.com/office/word/2018/wordml" xmlns:w16du="http://schemas.microsoft.com/office/word/2023/wordml/word16du" xmlns:w16sdtdh="http://schemas.microsoft.com/office/word/2020/wordml/sdtdatahash" xmlns:w16sdtfl="http://schemas.microsoft.com/office/word/2024/wordml/sdtformatlock" xmlns:w16se="http://schemas.microsoft.com/office/word/2015/wordml/symex" xmlns:wpg="http://schemas.microsoft.com/office/word/2010/wordprocessingGroup" xmlns:wpi="http://schemas.microsoft.com/office/word/2010/wordprocessingInk" xmlns:wne="http://schemas.microsoft.com/office/word/2006/wordml" xmlns:wps="http://schemas.microsoft.com/office/word/2010/wordprocessingShape" mc:Ignorable="w14 w15 w16se w16cid w16 w16cex w16sdtdh w16sdtfl w16du wp14">
   <w:body>
+    <w:p>
+      <w:pPr>
+        <w:rPr>
+          <w:b/>
+          <w:bCs/>
+          <w:sz w:val="32"/>
+          <w:szCs w:val="32"/>
+        </w:rPr>
+      </w:pPr>
+      <w:r>
+        <w:rPr>
+          <w:b/>
+          <w:bCs/>
+          <w:sz w:val="32"/>
+          <w:szCs w:val="32"/>
+        </w:rPr>
+        <w:t>DEELNEMERS</w:t>
+      </w:r>
+    </w:p>
+    <w:tbl>
+      <w:tblPr>
+        <w:tblStyle w:val="Tabelraster"/>
+        <w:tblW w:w="0" w:type="auto"/>
+        <w:tblLook w:val="04A0" w:firstRow="1" w:lastRow="0" w:firstColumn="1" w:lastColumn="0" w:noHBand="0" w:noVBand="1"/>
+      </w:tblPr>
+      <w:tblGrid>
+        <w:gridCol w:w="531"/>
+        <w:gridCol w:w="1446"/>
+        <w:gridCol w:w="420"/>
+        <w:gridCol w:w="2099"/>
+        <w:gridCol w:w="533"/>
+        <w:gridCol w:w="2256"/>
+        <w:gridCol w:w="1777"/>
+      </w:tblGrid>
+      <w:tr>
+        <w:tc>
+          <w:tcPr>
+            <w:tcW w:w="553" w:type="dxa"/>
+          </w:tcPr>
+          <w:p>
+            <w:pPr>
+              <w:rPr>
+                <w:sz w:val="18"/>
+                <w:szCs w:val="18"/>
+              </w:rPr>
+            </w:pPr>
+            <w:r>
+              <w:rPr>
+                <w:sz w:val="18"/>
+                <w:szCs w:val="18"/>
+              </w:rPr>
+              <w:t>D1</w:t>
+            </w:r>
+          </w:p>
+        </w:tc>
+        <w:tc>
+          <w:tcPr>
+            <w:tcW w:w="1531" w:type="dxa"/>
+          </w:tcPr>
+          <w:p>
+            <w:pPr>
+              <w:rPr>
+                <w:sz w:val="18"/>
+                <w:szCs w:val="18"/>
+              </w:rPr>
+            </w:pPr>
+            <w:r>
+              <w:rPr>
+                <w:sz w:val="18"/>
+                <w:szCs w:val="18"/>
+              </w:rPr>
+              <w:t>Toon Lehembre</w:t>
+            </w:r>
+          </w:p>
+        </w:tc>
+        <w:tc>
+          <w:tcPr>
+            <w:tcW w:w="423" w:type="dxa"/>
+          </w:tcPr>
+          <w:p>
+            <w:pPr>
+              <w:rPr>
+                <w:sz w:val="18"/>
+                <w:szCs w:val="18"/>
+              </w:rPr>
+            </w:pPr>
+            <w:r>
+              <w:rPr>
+                <w:sz w:val="18"/>
+                <w:szCs w:val="18"/>
+              </w:rPr>
+              <w:t>28</w:t>
+            </w:r>
+          </w:p>
+        </w:tc>
+        <w:tc>
+          <w:tcPr>
+            <w:tcW w:w="2253" w:type="dxa"/>
+          </w:tcPr>
+          <w:p>
+            <w:pPr>
+              <w:rPr>
+                <w:sz w:val="18"/>
+                <w:szCs w:val="18"/>
+              </w:rPr>
+            </w:pPr>
+            <w:r>
+              <w:rPr>
+                <w:sz w:val="18"/>
+                <w:szCs w:val="18"/>
+              </w:rPr>
+              <w:t>Toegepaste informatica, applicatie ontwikkeling</w:t>
+            </w:r>
+          </w:p>
+        </w:tc>
+        <w:tc>
+          <w:tcPr>
+            <w:tcW w:w="533" w:type="dxa"/>
+          </w:tcPr>
+          <w:p>
+            <w:pPr>
+              <w:rPr>
+                <w:sz w:val="18"/>
+                <w:szCs w:val="18"/>
+              </w:rPr>
+            </w:pPr>
+            <w:r>
+              <w:rPr>
+                <w:sz w:val="18"/>
+                <w:szCs w:val="18"/>
+              </w:rPr>
+              <w:t>Nee</w:t>
+            </w:r>
+          </w:p>
+        </w:tc>
+        <w:tc>
+          <w:tcPr>
+            <w:tcW w:w="2496" w:type="dxa"/>
+          </w:tcPr>
+          <w:p>
+            <w:pPr>
+              <w:rPr>
+                <w:sz w:val="18"/>
+                <w:szCs w:val="18"/>
+              </w:rPr>
+            </w:pPr>
+            <w:r>
+              <w:rPr>
+                <w:sz w:val="18"/>
+                <w:szCs w:val="18"/>
+              </w:rPr>
+              <w:t>Nee</w:t>
+            </w:r>
+          </w:p>
+        </w:tc>
+        <w:tc>
+          <w:tcPr>
+            <w:tcW w:w="1273" w:type="dxa"/>
+          </w:tcPr>
+          <w:p>
+            <w:pPr>
+              <w:rPr>
+                <w:sz w:val="18"/>
+                <w:szCs w:val="18"/>
+              </w:rPr>
+            </w:pPr>
+            <w:r>
+              <w:rPr>
+                <w:sz w:val="18"/>
+                <w:szCs w:val="18"/>
+              </w:rPr>
+              <w:t>Software developer</w:t>
+            </w:r>
+          </w:p>
+        </w:tc>
+      </w:tr>
+      <w:tr>
+        <w:tc>
+          <w:tcPr>
+            <w:tcW w:w="553" w:type="dxa"/>
+          </w:tcPr>
+          <w:p>
+            <w:pPr>
+              <w:rPr>
+                <w:sz w:val="18"/>
+                <w:szCs w:val="18"/>
+              </w:rPr>
+            </w:pPr>
+            <w:r>
+              <w:rPr>
+                <w:sz w:val="18"/>
+                <w:szCs w:val="18"/>
+              </w:rPr>
+              <w:t>D2</w:t>
+            </w:r>
+          </w:p>
+        </w:tc>
+        <w:tc>
+          <w:tcPr>
+            <w:tcW w:w="1531" w:type="dxa"/>
+          </w:tcPr>
+          <w:p>
+            <w:pPr>
+              <w:rPr>
+                <w:sz w:val="18"/>
+                <w:szCs w:val="18"/>
+              </w:rPr>
+            </w:pPr>
+            <w:r>
+              <w:rPr>
+                <w:sz w:val="18"/>
+                <w:szCs w:val="18"/>
+              </w:rPr>
+              <w:t>Frank Lieberwirth</w:t>
+            </w:r>
+          </w:p>
+        </w:tc>
+        <w:tc>
+          <w:tcPr>
+            <w:tcW w:w="423" w:type="dxa"/>
+          </w:tcPr>
+          <w:p>
+            <w:pPr>
+              <w:rPr>
+                <w:sz w:val="18"/>
+                <w:szCs w:val="18"/>
+              </w:rPr>
+            </w:pPr>
+            <w:r>
+              <w:rPr>
+                <w:sz w:val="18"/>
+                <w:szCs w:val="18"/>
+              </w:rPr>
+              <w:t>26</w:t>
+            </w:r>
+          </w:p>
+        </w:tc>
+        <w:tc>
+          <w:tcPr>
+            <w:tcW w:w="2253" w:type="dxa"/>
+          </w:tcPr>
+          <w:p>
+            <w:pPr>
+              <w:rPr>
+                <w:sz w:val="18"/>
+                <w:szCs w:val="18"/>
+              </w:rPr>
+            </w:pPr>
+            <w:r>
+              <w:rPr>
+                <w:sz w:val="18"/>
+                <w:szCs w:val="18"/>
+              </w:rPr>
+              <w:t>Toegepaste informatica, software management</w:t>
+            </w:r>
+          </w:p>
+        </w:tc>
+        <w:tc>
+          <w:tcPr>
+            <w:tcW w:w="533" w:type="dxa"/>
+          </w:tcPr>
+          <w:p>
+            <w:pPr>
+              <w:rPr>
+                <w:sz w:val="18"/>
+                <w:szCs w:val="18"/>
+              </w:rPr>
+            </w:pPr>
+            <w:r>
+              <w:rPr>
+                <w:sz w:val="18"/>
+                <w:szCs w:val="18"/>
+              </w:rPr>
+              <w:t>Ja</w:t>
+            </w:r>
+          </w:p>
+        </w:tc>
+        <w:tc>
+          <w:tcPr>
+            <w:tcW w:w="2496" w:type="dxa"/>
+          </w:tcPr>
+          <w:p>
+            <w:pPr>
+              <w:rPr>
+                <w:sz w:val="18"/>
+                <w:szCs w:val="18"/>
+              </w:rPr>
+            </w:pPr>
+            <w:r>
+              <w:rPr>
+                <w:sz w:val="18"/>
+                <w:szCs w:val="18"/>
+              </w:rPr>
+              <w:t>Nee, inbegrepen in opleiding en non-functional secrutiry requirements</w:t>
+            </w:r>
+          </w:p>
+        </w:tc>
+        <w:tc>
+          <w:tcPr>
+            <w:tcW w:w="1273" w:type="dxa"/>
+          </w:tcPr>
+          <w:p>
+            <w:pPr>
+              <w:rPr>
+                <w:sz w:val="18"/>
+                <w:szCs w:val="18"/>
+              </w:rPr>
+            </w:pPr>
+            <w:r>
+              <w:rPr>
+                <w:sz w:val="18"/>
+                <w:szCs w:val="18"/>
+              </w:rPr>
+              <w:t>Scrum master &amp; functional analyst</w:t>
+            </w:r>
+          </w:p>
+        </w:tc>
+      </w:tr>
+      <w:tr>
+        <w:tc>
+          <w:tcPr>
+            <w:tcW w:w="553" w:type="dxa"/>
+          </w:tcPr>
+          <w:p>
+            <w:pPr>
+              <w:rPr>
+                <w:sz w:val="18"/>
+                <w:szCs w:val="18"/>
+              </w:rPr>
+            </w:pPr>
+            <w:r>
+              <w:rPr>
+                <w:sz w:val="18"/>
+                <w:szCs w:val="18"/>
+              </w:rPr>
+              <w:t>D3</w:t>
+            </w:r>
+          </w:p>
+        </w:tc>
+        <w:tc>
+          <w:tcPr>
+            <w:tcW w:w="1531" w:type="dxa"/>
+          </w:tcPr>
+          <w:p>
+            <w:pPr>
+              <w:rPr>
+                <w:sz w:val="18"/>
+                <w:szCs w:val="18"/>
+              </w:rPr>
+            </w:pPr>
+            <w:r>
+              <w:rPr>
+                <w:sz w:val="18"/>
+                <w:szCs w:val="18"/>
+              </w:rPr>
+              <w:t>Jef Dello</w:t>
+            </w:r>
+          </w:p>
+        </w:tc>
+        <w:tc>
+          <w:tcPr>
+            <w:tcW w:w="423" w:type="dxa"/>
+          </w:tcPr>
+          <w:p>
+            <w:pPr>
+              <w:rPr>
+                <w:sz w:val="18"/>
+                <w:szCs w:val="18"/>
+              </w:rPr>
+            </w:pPr>
+            <w:r>
+              <w:rPr>
+                <w:sz w:val="18"/>
+                <w:szCs w:val="18"/>
+              </w:rPr>
+              <w:t>24</w:t>
+            </w:r>
+          </w:p>
+        </w:tc>
+        <w:tc>
+          <w:tcPr>
+            <w:tcW w:w="2253" w:type="dxa"/>
+          </w:tcPr>
+          <w:p>
+            <w:pPr>
+              <w:rPr>
+                <w:sz w:val="18"/>
+                <w:szCs w:val="18"/>
+              </w:rPr>
+            </w:pPr>
+            <w:r>
+              <w:rPr>
+                <w:sz w:val="18"/>
+                <w:szCs w:val="18"/>
+              </w:rPr>
+              <w:t>Toegepaste informatica</w:t>
+            </w:r>
+          </w:p>
+        </w:tc>
+        <w:tc>
+          <w:tcPr>
+            <w:tcW w:w="533" w:type="dxa"/>
+          </w:tcPr>
+          <w:p>
+            <w:pPr>
+              <w:rPr>
+                <w:sz w:val="18"/>
+                <w:szCs w:val="18"/>
+              </w:rPr>
+            </w:pPr>
+            <w:r>
+              <w:rPr>
+                <w:sz w:val="18"/>
+                <w:szCs w:val="18"/>
+              </w:rPr>
+              <w:t>Ja</w:t>
+            </w:r>
+          </w:p>
+        </w:tc>
+        <w:tc>
+          <w:tcPr>
+            <w:tcW w:w="2496" w:type="dxa"/>
+          </w:tcPr>
+          <w:p>
+            <w:pPr>
+              <w:rPr>
+                <w:sz w:val="18"/>
+                <w:szCs w:val="18"/>
+                <w:lang w:val="en-US"/>
+              </w:rPr>
+            </w:pPr>
+            <w:r>
+              <w:rPr>
+                <w:sz w:val="18"/>
+                <w:szCs w:val="18"/>
+                <w:lang w:val="en-US"/>
+              </w:rPr>
+              <w:t>Nee, security courses uhass</w:t>
+            </w:r>
+            <w:r>
+              <w:rPr>
+                <w:sz w:val="18"/>
+                <w:szCs w:val="18"/>
+                <w:lang w:val="en-US"/>
+              </w:rPr>
+              <w:t>elt en pxl en cybersecurity challenge</w:t>
+            </w:r>
+          </w:p>
+        </w:tc>
+        <w:tc>
+          <w:tcPr>
+            <w:tcW w:w="1273" w:type="dxa"/>
+          </w:tcPr>
+          <w:p>
+            <w:pPr>
+              <w:rPr>
+                <w:sz w:val="18"/>
+                <w:szCs w:val="18"/>
+                <w:lang w:val="en-US"/>
+              </w:rPr>
+            </w:pPr>
+            <w:r>
+              <w:rPr>
+                <w:sz w:val="18"/>
+                <w:szCs w:val="18"/>
+                <w:lang w:val="en-US"/>
+              </w:rPr>
+              <w:t>Student</w:t>
+            </w:r>
+          </w:p>
+        </w:tc>
+      </w:tr>
+      <w:tr>
+        <w:tc>
+          <w:tcPr>
+            <w:tcW w:w="553" w:type="dxa"/>
+          </w:tcPr>
+          <w:p>
+            <w:pPr>
+              <w:rPr>
+                <w:sz w:val="18"/>
+                <w:szCs w:val="18"/>
+              </w:rPr>
+            </w:pPr>
+            <w:r>
+              <w:rPr>
+                <w:sz w:val="18"/>
+                <w:szCs w:val="18"/>
+              </w:rPr>
+              <w:t>D4</w:t>
+            </w:r>
+          </w:p>
+        </w:tc>
+        <w:tc>
+          <w:tcPr>
+            <w:tcW w:w="1531" w:type="dxa"/>
+          </w:tcPr>
+          <w:p>
+            <w:pPr>
+              <w:rPr>
+                <w:sz w:val="18"/>
+                <w:szCs w:val="18"/>
+              </w:rPr>
+            </w:pPr>
+            <w:r>
+              <w:rPr>
+                <w:sz w:val="18"/>
+                <w:szCs w:val="18"/>
+              </w:rPr>
+              <w:t>Abdullah Yalvac</w:t>
+            </w:r>
+          </w:p>
+        </w:tc>
+        <w:tc>
+          <w:tcPr>
+            <w:tcW w:w="423" w:type="dxa"/>
+          </w:tcPr>
+          <w:p>
+            <w:pPr>
+              <w:rPr>
+                <w:sz w:val="18"/>
+                <w:szCs w:val="18"/>
+              </w:rPr>
+            </w:pPr>
+            <w:r>
+              <w:rPr>
+                <w:sz w:val="18"/>
+                <w:szCs w:val="18"/>
+              </w:rPr>
+              <w:t>22</w:t>
+            </w:r>
+          </w:p>
+        </w:tc>
+        <w:tc>
+          <w:tcPr>
+            <w:tcW w:w="2253" w:type="dxa"/>
+          </w:tcPr>
+          <w:p>
+            <w:pPr>
+              <w:rPr>
+                <w:sz w:val="18"/>
+                <w:szCs w:val="18"/>
+              </w:rPr>
+            </w:pPr>
+            <w:r>
+              <w:rPr>
+                <w:sz w:val="18"/>
+                <w:szCs w:val="18"/>
+              </w:rPr>
+              <w:t>Industiële wetenschappen informatica</w:t>
+            </w:r>
+          </w:p>
+        </w:tc>
+        <w:tc>
+          <w:tcPr>
+            <w:tcW w:w="533" w:type="dxa"/>
+          </w:tcPr>
+          <w:p>
+            <w:pPr>
+              <w:rPr>
+                <w:sz w:val="18"/>
+                <w:szCs w:val="18"/>
+              </w:rPr>
+            </w:pPr>
+            <w:r>
+              <w:rPr>
+                <w:sz w:val="18"/>
+                <w:szCs w:val="18"/>
+              </w:rPr>
+              <w:t>Ja</w:t>
+            </w:r>
+          </w:p>
+        </w:tc>
+        <w:tc>
+          <w:tcPr>
+            <w:tcW w:w="2496" w:type="dxa"/>
+          </w:tcPr>
+          <w:p>
+            <w:pPr>
+              <w:rPr>
+                <w:sz w:val="18"/>
+                <w:szCs w:val="18"/>
+              </w:rPr>
+            </w:pPr>
+            <w:r>
+              <w:rPr>
+                <w:sz w:val="18"/>
+                <w:szCs w:val="18"/>
+              </w:rPr>
+              <w:t>Nee</w:t>
+            </w:r>
+          </w:p>
+        </w:tc>
+        <w:tc>
+          <w:tcPr>
+            <w:tcW w:w="1273" w:type="dxa"/>
+          </w:tcPr>
+          <w:p>
+            <w:pPr>
+              <w:rPr>
+                <w:sz w:val="18"/>
+                <w:szCs w:val="18"/>
+              </w:rPr>
+            </w:pPr>
+            <w:r>
+              <w:rPr>
+                <w:sz w:val="18"/>
+                <w:szCs w:val="18"/>
+              </w:rPr>
+              <w:t>Student</w:t>
+            </w:r>
+          </w:p>
+        </w:tc>
+      </w:tr>
+      <w:tr>
+        <w:tc>
+          <w:tcPr>
+            <w:tcW w:w="553" w:type="dxa"/>
+          </w:tcPr>
+          <w:p>
+            <w:pPr>
+              <w:rPr>
+                <w:sz w:val="18"/>
+                <w:szCs w:val="18"/>
+              </w:rPr>
+            </w:pPr>
+            <w:r>
+              <w:rPr>
+                <w:sz w:val="18"/>
+                <w:szCs w:val="18"/>
+              </w:rPr>
+              <w:t>D5</w:t>
+            </w:r>
+          </w:p>
+        </w:tc>
+        <w:tc>
+          <w:tcPr>
+            <w:tcW w:w="1531" w:type="dxa"/>
+          </w:tcPr>
+          <w:p>
+            <w:pPr>
+              <w:rPr>
+                <w:sz w:val="18"/>
+                <w:szCs w:val="18"/>
+              </w:rPr>
+            </w:pPr>
+            <w:r>
+              <w:rPr>
+                <w:sz w:val="18"/>
+                <w:szCs w:val="18"/>
+              </w:rPr>
+              <w:t>Jelle Beerts</w:t>
+            </w:r>
+          </w:p>
+        </w:tc>
+        <w:tc>
+          <w:tcPr>
+            <w:tcW w:w="423" w:type="dxa"/>
+          </w:tcPr>
+          <w:p>
+            <w:pPr>
+              <w:rPr>
+                <w:sz w:val="18"/>
+                <w:szCs w:val="18"/>
+              </w:rPr>
+            </w:pPr>
+            <w:r>
+              <w:rPr>
+                <w:sz w:val="18"/>
+                <w:szCs w:val="18"/>
+              </w:rPr>
+              <w:t>23</w:t>
+            </w:r>
+          </w:p>
+        </w:tc>
+        <w:tc>
+          <w:tcPr>
+            <w:tcW w:w="2253" w:type="dxa"/>
+          </w:tcPr>
+          <w:p>
+            <w:pPr>
+              <w:rPr>
+                <w:sz w:val="18"/>
+                <w:szCs w:val="18"/>
+              </w:rPr>
+            </w:pPr>
+            <w:r>
+              <w:rPr>
+                <w:sz w:val="18"/>
+                <w:szCs w:val="18"/>
+              </w:rPr>
+              <w:t>Master informatica</w:t>
+            </w:r>
+          </w:p>
+        </w:tc>
+        <w:tc>
+          <w:tcPr>
+            <w:tcW w:w="533" w:type="dxa"/>
+          </w:tcPr>
+          <w:p>
+            <w:pPr>
+              <w:rPr>
+                <w:sz w:val="18"/>
+                <w:szCs w:val="18"/>
+              </w:rPr>
+            </w:pPr>
+            <w:r>
+              <w:rPr>
+                <w:sz w:val="18"/>
+                <w:szCs w:val="18"/>
+              </w:rPr>
+              <w:t>Ja</w:t>
+            </w:r>
+          </w:p>
+        </w:tc>
+        <w:tc>
+          <w:tcPr>
+            <w:tcW w:w="2496" w:type="dxa"/>
+          </w:tcPr>
+          <w:p>
+            <w:pPr>
+              <w:rPr>
+                <w:sz w:val="18"/>
+                <w:szCs w:val="18"/>
+              </w:rPr>
+            </w:pPr>
+            <w:r>
+              <w:rPr>
+                <w:sz w:val="18"/>
+                <w:szCs w:val="18"/>
+              </w:rPr>
+              <w:t>Nee</w:t>
+            </w:r>
+          </w:p>
+        </w:tc>
+        <w:tc>
+          <w:tcPr>
+            <w:tcW w:w="1273" w:type="dxa"/>
+          </w:tcPr>
+          <w:p>
+            <w:pPr>
+              <w:rPr>
+                <w:sz w:val="18"/>
+                <w:szCs w:val="18"/>
+              </w:rPr>
+            </w:pPr>
+            <w:r>
+              <w:rPr>
+                <w:sz w:val="18"/>
+                <w:szCs w:val="18"/>
+              </w:rPr>
+              <w:t>Data engineer/consultant</w:t>
+            </w:r>
+          </w:p>
+        </w:tc>
+      </w:tr>
+      <w:tr>
+        <w:tc>
+          <w:tcPr>
+            <w:tcW w:w="553" w:type="dxa"/>
+          </w:tcPr>
+          <w:p>
+            <w:pPr>
+              <w:rPr>
+                <w:sz w:val="18"/>
+                <w:szCs w:val="18"/>
+              </w:rPr>
+            </w:pPr>
+            <w:r>
+              <w:rPr>
+                <w:sz w:val="18"/>
+                <w:szCs w:val="18"/>
+              </w:rPr>
+              <w:t>D6</w:t>
+            </w:r>
+          </w:p>
+        </w:tc>
+        <w:tc>
+          <w:tcPr>
+            <w:tcW w:w="1531" w:type="dxa"/>
+          </w:tcPr>
+          <w:p>
+            <w:pPr>
+              <w:rPr>
+                <w:sz w:val="18"/>
+                <w:szCs w:val="18"/>
+              </w:rPr>
+            </w:pPr>
+            <w:r>
+              <w:rPr>
+                <w:sz w:val="18"/>
+                <w:szCs w:val="18"/>
+              </w:rPr>
+              <w:t>Michiel</w:t>
+            </w:r>
+          </w:p>
+        </w:tc>
+        <w:tc>
+          <w:tcPr>
+            <w:tcW w:w="423" w:type="dxa"/>
+          </w:tcPr>
+          <w:p>
+            <w:pPr>
+              <w:rPr>
+                <w:sz w:val="18"/>
+                <w:szCs w:val="18"/>
+              </w:rPr>
+            </w:pPr>
+            <w:r>
+              <w:rPr>
+                <w:sz w:val="18"/>
+                <w:szCs w:val="18"/>
+              </w:rPr>
+              <w:t>24</w:t>
+            </w:r>
+          </w:p>
+        </w:tc>
+        <w:tc>
+          <w:tcPr>
+            <w:tcW w:w="2253" w:type="dxa"/>
+          </w:tcPr>
+          <w:p>
+            <w:pPr>
+              <w:rPr>
+                <w:sz w:val="18"/>
+                <w:szCs w:val="18"/>
+              </w:rPr>
+            </w:pPr>
+            <w:r>
+              <w:rPr>
+                <w:sz w:val="18"/>
+                <w:szCs w:val="18"/>
+              </w:rPr>
+              <w:t>Toegepaste IT – AI &amp; Robotics</w:t>
+            </w:r>
+          </w:p>
+        </w:tc>
+        <w:tc>
+          <w:tcPr>
+            <w:tcW w:w="533" w:type="dxa"/>
+          </w:tcPr>
+          <w:p>
+            <w:pPr>
+              <w:rPr>
+                <w:sz w:val="18"/>
+                <w:szCs w:val="18"/>
+              </w:rPr>
+            </w:pPr>
+            <w:r>
+              <w:rPr>
+                <w:sz w:val="18"/>
+                <w:szCs w:val="18"/>
+              </w:rPr>
+              <w:t>Ja</w:t>
+            </w:r>
+          </w:p>
+        </w:tc>
+        <w:tc>
+          <w:tcPr>
+            <w:tcW w:w="2496" w:type="dxa"/>
+          </w:tcPr>
+          <w:p>
+            <w:pPr>
+              <w:rPr>
+                <w:sz w:val="18"/>
+                <w:szCs w:val="18"/>
+              </w:rPr>
+            </w:pPr>
+            <w:r>
+              <w:rPr>
+                <w:sz w:val="18"/>
+                <w:szCs w:val="18"/>
+              </w:rPr>
+              <w:t>Nee</w:t>
+            </w:r>
+          </w:p>
+        </w:tc>
+        <w:tc>
+          <w:tcPr>
+            <w:tcW w:w="1273" w:type="dxa"/>
+          </w:tcPr>
+          <w:p>
+            <w:pPr>
+              <w:rPr>
+                <w:sz w:val="18"/>
+                <w:szCs w:val="18"/>
+              </w:rPr>
+            </w:pPr>
+            <w:r>
+              <w:rPr>
+                <w:sz w:val="18"/>
+                <w:szCs w:val="18"/>
+              </w:rPr>
+              <w:t>.Net software developer</w:t>
+            </w:r>
+          </w:p>
+        </w:tc>
+      </w:tr>
+      <w:tr>
+        <w:tc>
+          <w:tcPr>
+            <w:tcW w:w="553" w:type="dxa"/>
+          </w:tcPr>
+          <w:p>
+            <w:pPr>
+              <w:rPr>
+                <w:sz w:val="18"/>
+                <w:szCs w:val="18"/>
+              </w:rPr>
+            </w:pPr>
+            <w:r>
+              <w:rPr>
+                <w:sz w:val="18"/>
+                <w:szCs w:val="18"/>
+              </w:rPr>
+              <w:t>D7</w:t>
+            </w:r>
+          </w:p>
+        </w:tc>
+        <w:tc>
+          <w:tcPr>
+            <w:tcW w:w="1531" w:type="dxa"/>
+          </w:tcPr>
+          <w:p>
+            <w:pPr>
+              <w:rPr>
+                <w:sz w:val="18"/>
+                <w:szCs w:val="18"/>
+              </w:rPr>
+            </w:pPr>
+            <w:r>
+              <w:rPr>
+                <w:sz w:val="18"/>
+                <w:szCs w:val="18"/>
+              </w:rPr>
+              <w:t>Robbe Caenen</w:t>
+            </w:r>
+          </w:p>
+        </w:tc>
+        <w:tc>
+          <w:tcPr>
+            <w:tcW w:w="423" w:type="dxa"/>
+          </w:tcPr>
+          <w:p>
+            <w:pPr>
+              <w:rPr>
+                <w:sz w:val="18"/>
+                <w:szCs w:val="18"/>
+              </w:rPr>
+            </w:pPr>
+            <w:r>
+              <w:rPr>
+                <w:sz w:val="18"/>
+                <w:szCs w:val="18"/>
+              </w:rPr>
+              <w:t>24</w:t>
+            </w:r>
+          </w:p>
+        </w:tc>
+        <w:tc>
+          <w:tcPr>
+            <w:tcW w:w="2253" w:type="dxa"/>
+          </w:tcPr>
+          <w:p>
+            <w:pPr>
+              <w:rPr>
+                <w:sz w:val="18"/>
+                <w:szCs w:val="18"/>
+              </w:rPr>
+            </w:pPr>
+            <w:r>
+              <w:rPr>
+                <w:sz w:val="18"/>
+                <w:szCs w:val="18"/>
+              </w:rPr>
+              <w:t>Toegepaste IT – AI</w:t>
+            </w:r>
+          </w:p>
+        </w:tc>
+        <w:tc>
+          <w:tcPr>
+            <w:tcW w:w="533" w:type="dxa"/>
+          </w:tcPr>
+          <w:p>
+            <w:pPr>
+              <w:rPr>
+                <w:sz w:val="18"/>
+                <w:szCs w:val="18"/>
+              </w:rPr>
+            </w:pPr>
+            <w:r>
+              <w:rPr>
+                <w:sz w:val="18"/>
+                <w:szCs w:val="18"/>
+              </w:rPr>
+              <w:t>Ja</w:t>
+            </w:r>
+          </w:p>
+        </w:tc>
+        <w:tc>
+          <w:tcPr>
+            <w:tcW w:w="2496" w:type="dxa"/>
+          </w:tcPr>
+          <w:p>
+            <w:pPr>
+              <w:rPr>
+                <w:sz w:val="18"/>
+                <w:szCs w:val="18"/>
+              </w:rPr>
+            </w:pPr>
+            <w:r>
+              <w:rPr>
+                <w:sz w:val="18"/>
+                <w:szCs w:val="18"/>
+              </w:rPr>
+              <w:t>Nee</w:t>
+            </w:r>
+          </w:p>
+        </w:tc>
+        <w:tc>
+          <w:tcPr>
+            <w:tcW w:w="1273" w:type="dxa"/>
+          </w:tcPr>
+          <w:p>
+            <w:pPr>
+              <w:rPr>
+                <w:sz w:val="18"/>
+                <w:szCs w:val="18"/>
+              </w:rPr>
+            </w:pPr>
+            <w:r>
+              <w:rPr>
+                <w:sz w:val="18"/>
+                <w:szCs w:val="18"/>
+              </w:rPr>
+              <w:t>Junior software developer</w:t>
+            </w:r>
+          </w:p>
+        </w:tc>
+      </w:tr>
+      <w:tr>
+        <w:tc>
+          <w:tcPr>
+            <w:tcW w:w="553" w:type="dxa"/>
+          </w:tcPr>
+          <w:p>
+            <w:pPr>
+              <w:rPr>
+                <w:sz w:val="18"/>
+                <w:szCs w:val="18"/>
+              </w:rPr>
+            </w:pPr>
+            <w:r>
+              <w:rPr>
+                <w:sz w:val="18"/>
+                <w:szCs w:val="18"/>
+              </w:rPr>
+              <w:t>D8</w:t>
+            </w:r>
+          </w:p>
+        </w:tc>
+        <w:tc>
+          <w:tcPr>
+            <w:tcW w:w="1531" w:type="dxa"/>
+          </w:tcPr>
+          <w:p>
+            <w:pPr>
+              <w:rPr>
+                <w:sz w:val="18"/>
+                <w:szCs w:val="18"/>
+              </w:rPr>
+            </w:pPr>
+            <w:r>
+              <w:rPr>
+                <w:sz w:val="18"/>
+                <w:szCs w:val="18"/>
+              </w:rPr>
+              <w:t>Ebbe Wertz</w:t>
+            </w:r>
+          </w:p>
+        </w:tc>
+        <w:tc>
+          <w:tcPr>
+            <w:tcW w:w="423" w:type="dxa"/>
+          </w:tcPr>
+          <w:p>
+            <w:pPr>
+              <w:rPr>
+                <w:sz w:val="18"/>
+                <w:szCs w:val="18"/>
+              </w:rPr>
+            </w:pPr>
+            <w:r>
+              <w:rPr>
+                <w:sz w:val="18"/>
+                <w:szCs w:val="18"/>
+              </w:rPr>
+              <w:t>20</w:t>
+            </w:r>
+          </w:p>
+        </w:tc>
+        <w:tc>
+          <w:tcPr>
+            <w:tcW w:w="2253" w:type="dxa"/>
+          </w:tcPr>
+          <w:p>
+            <w:pPr>
+              <w:rPr>
+                <w:sz w:val="18"/>
+                <w:szCs w:val="18"/>
+              </w:rPr>
+            </w:pPr>
+            <w:r>
+              <w:rPr>
+                <w:sz w:val="18"/>
+                <w:szCs w:val="18"/>
+              </w:rPr>
+              <w:t>IIW-master infortmatica</w:t>
+            </w:r>
+          </w:p>
+        </w:tc>
+        <w:tc>
+          <w:tcPr>
+            <w:tcW w:w="533" w:type="dxa"/>
+          </w:tcPr>
+          <w:p>
+            <w:pPr>
+              <w:rPr>
+                <w:sz w:val="18"/>
+                <w:szCs w:val="18"/>
+              </w:rPr>
+            </w:pPr>
+            <w:r>
+              <w:rPr>
+                <w:sz w:val="18"/>
+                <w:szCs w:val="18"/>
+              </w:rPr>
+              <w:t>Ja</w:t>
+            </w:r>
+          </w:p>
+        </w:tc>
+        <w:tc>
+          <w:tcPr>
+            <w:tcW w:w="2496" w:type="dxa"/>
+          </w:tcPr>
+          <w:p>
+            <w:pPr>
+              <w:rPr>
+                <w:sz w:val="18"/>
+                <w:szCs w:val="18"/>
+              </w:rPr>
+            </w:pPr>
+            <w:r>
+              <w:rPr>
+                <w:sz w:val="18"/>
+                <w:szCs w:val="18"/>
+              </w:rPr>
+              <w:t>Nee, wel een vak over cybersecurity</w:t>
+            </w:r>
+          </w:p>
+        </w:tc>
+        <w:tc>
+          <w:tcPr>
+            <w:tcW w:w="1273" w:type="dxa"/>
+          </w:tcPr>
+          <w:p>
+            <w:pPr>
+              <w:rPr>
+                <w:sz w:val="18"/>
+                <w:szCs w:val="18"/>
+              </w:rPr>
+            </w:pPr>
+            <w:r>
+              <w:rPr>
+                <w:sz w:val="18"/>
+                <w:szCs w:val="18"/>
+              </w:rPr>
+              <w:t>Student</w:t>
+            </w:r>
+          </w:p>
+        </w:tc>
+      </w:tr>
+      <w:tr>
+        <w:tc>
+          <w:tcPr>
+            <w:tcW w:w="553" w:type="dxa"/>
+          </w:tcPr>
+          <w:p>
+            <w:pPr>
+              <w:rPr>
+                <w:sz w:val="18"/>
+                <w:szCs w:val="18"/>
+              </w:rPr>
+            </w:pPr>
+            <w:r>
+              <w:rPr>
+                <w:sz w:val="18"/>
+                <w:szCs w:val="18"/>
+              </w:rPr>
+              <w:t>D9</w:t>
+            </w:r>
+          </w:p>
+        </w:tc>
+        <w:tc>
+          <w:tcPr>
+            <w:tcW w:w="1531" w:type="dxa"/>
+          </w:tcPr>
+          <w:p>
+            <w:pPr>
+              <w:rPr>
+                <w:sz w:val="18"/>
+                <w:szCs w:val="18"/>
+              </w:rPr>
+            </w:pPr>
+            <w:r>
+              <w:rPr>
+                <w:sz w:val="18"/>
+                <w:szCs w:val="18"/>
+              </w:rPr>
+              <w:t>Jenthe Lowist</w:t>
+            </w:r>
+          </w:p>
+        </w:tc>
+        <w:tc>
+          <w:tcPr>
+            <w:tcW w:w="423" w:type="dxa"/>
+          </w:tcPr>
+          <w:p>
+            <w:pPr>
+              <w:rPr>
+                <w:sz w:val="18"/>
+                <w:szCs w:val="18"/>
+              </w:rPr>
+            </w:pPr>
+            <w:r>
+              <w:rPr>
+                <w:sz w:val="18"/>
+                <w:szCs w:val="18"/>
+              </w:rPr>
+              <w:t>24</w:t>
+            </w:r>
+          </w:p>
+        </w:tc>
+        <w:tc>
+          <w:tcPr>
+            <w:tcW w:w="2253" w:type="dxa"/>
+          </w:tcPr>
+          <w:p>
+            <w:pPr>
+              <w:rPr>
+                <w:sz w:val="18"/>
+                <w:szCs w:val="18"/>
+              </w:rPr>
+            </w:pPr>
+            <w:r>
+              <w:rPr>
+                <w:sz w:val="18"/>
+                <w:szCs w:val="18"/>
+              </w:rPr>
+              <w:t>IIW informatica</w:t>
+            </w:r>
+          </w:p>
+        </w:tc>
+        <w:tc>
+          <w:tcPr>
+            <w:tcW w:w="533" w:type="dxa"/>
+          </w:tcPr>
+          <w:p>
+            <w:pPr>
+              <w:rPr>
+                <w:sz w:val="18"/>
+                <w:szCs w:val="18"/>
+              </w:rPr>
+            </w:pPr>
+            <w:r>
+              <w:rPr>
+                <w:sz w:val="18"/>
+                <w:szCs w:val="18"/>
+              </w:rPr>
+              <w:t>Ja</w:t>
+            </w:r>
+          </w:p>
+        </w:tc>
+        <w:tc>
+          <w:tcPr>
+            <w:tcW w:w="2496" w:type="dxa"/>
+          </w:tcPr>
+          <w:p>
+            <w:pPr>
+              <w:rPr>
+                <w:sz w:val="18"/>
+                <w:szCs w:val="18"/>
+              </w:rPr>
+            </w:pPr>
+            <w:r>
+              <w:rPr>
+                <w:sz w:val="18"/>
+                <w:szCs w:val="18"/>
+              </w:rPr>
+              <w:t>Ja, tijdens opleiding met STRIDE, attack trees, etc.</w:t>
+            </w:r>
+          </w:p>
+        </w:tc>
+        <w:tc>
+          <w:tcPr>
+            <w:tcW w:w="1273" w:type="dxa"/>
+          </w:tcPr>
+          <w:p>
+            <w:pPr>
+              <w:rPr>
+                <w:sz w:val="18"/>
+                <w:szCs w:val="18"/>
+              </w:rPr>
+            </w:pPr>
+            <w:r>
+              <w:rPr>
+                <w:sz w:val="18"/>
+                <w:szCs w:val="18"/>
+              </w:rPr>
+              <w:t>MES software engineer</w:t>
+            </w:r>
+          </w:p>
+        </w:tc>
+      </w:tr>
+    </w:tbl>
+    <w:p>
+      <w:pPr>
+        <w:rPr>
+          <w:b/>
+          <w:bCs/>
+          <w:sz w:val="32"/>
+          <w:szCs w:val="32"/>
+        </w:rPr>
+      </w:pPr>
+    </w:p>
+    <w:p>
+      <w:pPr>
+        <w:rPr>
+          <w:b/>
+          <w:bCs/>
+          <w:sz w:val="32"/>
+          <w:szCs w:val="32"/>
+        </w:rPr>
+      </w:pPr>
+      <w:r>
+        <w:rPr>
+          <w:b/>
+          <w:bCs/>
+          <w:sz w:val="32"/>
+          <w:szCs w:val="32"/>
+        </w:rPr>
+        <w:br w:type="page"/>
+      </w:r>
+    </w:p>
     <w:p>
       <w:pPr>
         <w:ind w:left="720" w:hanging="360"/>
@@ -19,7 +1373,8 @@
           <w:sz w:val="32"/>
           <w:szCs w:val="32"/>
         </w:rPr>
-        <w:t>Antwoorden op de open vragen</w:t>
+        <w:lastRenderedPageBreak/>
+        <w:t>ANTWOORDEN OP VRAGEN</w:t>
       </w:r>
     </w:p>
     <w:p>
@@ -41,11 +1396,7 @@
     </w:p>
     <w:p>
       <w:pPr>
-        <w:pStyle w:val="Lijstalinea"/>
-        <w:numPr>
-          <w:ilvl w:val="1"/>
-          <w:numId w:val="1"/>
-        </w:numPr>
+        <w:ind w:left="12" w:firstLine="708"/>
         <w:rPr>
           <w:sz w:val="22"/>
           <w:szCs w:val="22"/>
@@ -58,82 +1409,12 @@
           <w:szCs w:val="22"/>
           <w:lang w:val="en-US"/>
         </w:rPr>
-        <w:t>Ja</w:t>
-      </w:r>
-    </w:p>
-    <w:p>
-      <w:pPr>
-        <w:pStyle w:val="Lijstalinea"/>
-        <w:numPr>
-          <w:ilvl w:val="1"/>
-          <w:numId w:val="1"/>
-        </w:numPr>
-        <w:rPr>
-          <w:sz w:val="22"/>
-          <w:szCs w:val="22"/>
-          <w:lang w:val="en-US"/>
-        </w:rPr>
-      </w:pPr>
-      <w:r>
-        <w:rPr>
-          <w:sz w:val="22"/>
-          <w:szCs w:val="22"/>
-          <w:lang w:val="en-US"/>
-        </w:rPr>
-        <w:t>Ja</w:t>
-      </w:r>
-    </w:p>
-    <w:p>
-      <w:pPr>
-        <w:pStyle w:val="Lijstalinea"/>
-        <w:numPr>
-          <w:ilvl w:val="1"/>
-          <w:numId w:val="1"/>
-        </w:numPr>
-        <w:rPr>
-          <w:sz w:val="22"/>
-          <w:szCs w:val="22"/>
-          <w:lang w:val="en-US"/>
-        </w:rPr>
-      </w:pPr>
-      <w:r>
-        <w:rPr>
-          <w:sz w:val="22"/>
-          <w:szCs w:val="22"/>
-          <w:lang w:val="en-US"/>
-        </w:rPr>
-        <w:t>Ja</w:t>
-      </w:r>
-    </w:p>
-    <w:p>
-      <w:pPr>
-        <w:pStyle w:val="Lijstalinea"/>
-        <w:numPr>
-          <w:ilvl w:val="1"/>
-          <w:numId w:val="1"/>
-        </w:numPr>
-        <w:rPr>
-          <w:sz w:val="22"/>
-          <w:szCs w:val="22"/>
-          <w:lang w:val="en-US"/>
-        </w:rPr>
-      </w:pPr>
-      <w:r>
-        <w:rPr>
-          <w:sz w:val="22"/>
-          <w:szCs w:val="22"/>
-          <w:lang w:val="en-US"/>
-        </w:rPr>
-        <w:t>Ja, useless maar duidelijk</w:t>
-      </w:r>
-    </w:p>
-    <w:p>
-      <w:pPr>
-        <w:pStyle w:val="Lijstalinea"/>
-        <w:numPr>
-          <w:ilvl w:val="1"/>
-          <w:numId w:val="1"/>
-        </w:numPr>
+        <w:t>D1. Ja</w:t>
+      </w:r>
+    </w:p>
+    <w:p>
+      <w:pPr>
+        <w:ind w:firstLine="708"/>
         <w:rPr>
           <w:sz w:val="22"/>
           <w:szCs w:val="22"/>
@@ -144,21 +1425,8 @@
           <w:sz w:val="22"/>
           <w:szCs w:val="22"/>
         </w:rPr>
-        <w:t>Ja, geeft duidelijk overzicht van mogelijke issues en of hierover nagedacht is</w:t>
-      </w:r>
-    </w:p>
-    <w:p>
-      <w:pPr>
-        <w:pStyle w:val="Lijstalinea"/>
-        <w:numPr>
-          <w:ilvl w:val="1"/>
-          <w:numId w:val="1"/>
-        </w:numPr>
-        <w:rPr>
-          <w:sz w:val="22"/>
-          <w:szCs w:val="22"/>
-        </w:rPr>
-      </w:pPr>
+        <w:t xml:space="preserve">D2. </w:t>
+      </w:r>
       <w:r>
         <w:rPr>
           <w:sz w:val="22"/>
@@ -169,11 +1437,7 @@
     </w:p>
     <w:p>
       <w:pPr>
-        <w:pStyle w:val="Lijstalinea"/>
-        <w:numPr>
-          <w:ilvl w:val="1"/>
-          <w:numId w:val="1"/>
-        </w:numPr>
+        <w:ind w:firstLine="708"/>
         <w:rPr>
           <w:sz w:val="22"/>
           <w:szCs w:val="22"/>
@@ -184,21 +1448,31 @@
           <w:sz w:val="22"/>
           <w:szCs w:val="22"/>
         </w:rPr>
-        <w:t>Het was snel duidelijk</w:t>
-      </w:r>
-    </w:p>
-    <w:p>
-      <w:pPr>
-        <w:pStyle w:val="Lijstalinea"/>
-        <w:numPr>
-          <w:ilvl w:val="1"/>
-          <w:numId w:val="1"/>
-        </w:numPr>
+        <w:t>D3. Het was snel d</w:t>
+      </w:r>
+      <w:r>
         <w:rPr>
           <w:sz w:val="22"/>
           <w:szCs w:val="22"/>
         </w:rPr>
-      </w:pPr>
+        <w:t>uidelijk</w:t>
+      </w:r>
+    </w:p>
+    <w:p>
+      <w:pPr>
+        <w:ind w:firstLine="708"/>
+        <w:rPr>
+          <w:sz w:val="22"/>
+          <w:szCs w:val="22"/>
+        </w:rPr>
+      </w:pPr>
+      <w:r>
+        <w:rPr>
+          <w:sz w:val="22"/>
+          <w:szCs w:val="22"/>
+        </w:rPr>
+        <w:t xml:space="preserve">D4. </w:t>
+      </w:r>
       <w:r>
         <w:rPr>
           <w:sz w:val="22"/>
@@ -209,16 +1483,56 @@
     </w:p>
     <w:p>
       <w:pPr>
-        <w:pStyle w:val="Lijstalinea"/>
-        <w:numPr>
-          <w:ilvl w:val="1"/>
-          <w:numId w:val="1"/>
-        </w:numPr>
+        <w:ind w:firstLine="708"/>
         <w:rPr>
           <w:sz w:val="22"/>
           <w:szCs w:val="22"/>
         </w:rPr>
       </w:pPr>
+      <w:r>
+        <w:rPr>
+          <w:sz w:val="22"/>
+          <w:szCs w:val="22"/>
+        </w:rPr>
+        <w:t xml:space="preserve">D5. </w:t>
+      </w:r>
+      <w:r>
+        <w:rPr>
+          <w:sz w:val="22"/>
+          <w:szCs w:val="22"/>
+        </w:rPr>
+        <w:t xml:space="preserve">Ja, geeft duidelijk overzicht van mogelijke issues en of hierover </w:t>
+      </w:r>
+      <w:r>
+        <w:rPr>
+          <w:sz w:val="22"/>
+          <w:szCs w:val="22"/>
+        </w:rPr>
+        <w:t xml:space="preserve">is </w:t>
+      </w:r>
+      <w:r>
+        <w:rPr>
+          <w:sz w:val="22"/>
+          <w:szCs w:val="22"/>
+        </w:rPr>
+        <w:t>nagedacht</w:t>
+      </w:r>
+    </w:p>
+    <w:p>
+      <w:pPr>
+        <w:ind w:firstLine="708"/>
+        <w:rPr>
+          <w:sz w:val="22"/>
+          <w:szCs w:val="22"/>
+        </w:rPr>
+      </w:pPr>
+      <w:r>
+        <w:rPr>
+          <w:sz w:val="22"/>
+          <w:szCs w:val="22"/>
+        </w:rPr>
+        <w:t xml:space="preserve">D6. </w:t>
+      </w:r>
       <w:r>
         <w:rPr>
           <w:sz w:val="22"/>
@@ -226,6 +1540,84 @@
         </w:rPr>
         <w:t>Ja</w:t>
       </w:r>
+      <w:r>
+        <w:rPr>
+          <w:sz w:val="22"/>
+          <w:szCs w:val="22"/>
+        </w:rPr>
+        <w:t>, volgens mij nutteloos maar duidelijk</w:t>
+      </w:r>
+    </w:p>
+    <w:p>
+      <w:pPr>
+        <w:ind w:firstLine="708"/>
+        <w:rPr>
+          <w:sz w:val="22"/>
+          <w:szCs w:val="22"/>
+        </w:rPr>
+      </w:pPr>
+      <w:r>
+        <w:rPr>
+          <w:sz w:val="22"/>
+          <w:szCs w:val="22"/>
+        </w:rPr>
+        <w:t>D7. Ja</w:t>
+      </w:r>
+    </w:p>
+    <w:p>
+      <w:pPr>
+        <w:ind w:firstLine="708"/>
+        <w:rPr>
+          <w:sz w:val="22"/>
+          <w:szCs w:val="22"/>
+        </w:rPr>
+      </w:pPr>
+      <w:r>
+        <w:rPr>
+          <w:sz w:val="22"/>
+          <w:szCs w:val="22"/>
+        </w:rPr>
+        <w:t xml:space="preserve">D8. </w:t>
+      </w:r>
+      <w:r>
+        <w:rPr>
+          <w:sz w:val="22"/>
+          <w:szCs w:val="22"/>
+        </w:rPr>
+        <w:t>Ja</w:t>
+      </w:r>
+    </w:p>
+    <w:p>
+      <w:pPr>
+        <w:ind w:firstLine="708"/>
+        <w:rPr>
+          <w:sz w:val="22"/>
+          <w:szCs w:val="22"/>
+        </w:rPr>
+      </w:pPr>
+      <w:r>
+        <w:rPr>
+          <w:sz w:val="22"/>
+          <w:szCs w:val="22"/>
+        </w:rPr>
+        <w:t xml:space="preserve">D9. </w:t>
+      </w:r>
+      <w:r>
+        <w:rPr>
+          <w:sz w:val="22"/>
+          <w:szCs w:val="22"/>
+        </w:rPr>
+        <w:t>Ja</w:t>
+      </w:r>
+    </w:p>
+    <w:p>
+      <w:pPr>
+        <w:ind w:firstLine="708"/>
+        <w:rPr>
+          <w:sz w:val="22"/>
+          <w:szCs w:val="22"/>
+        </w:rPr>
+      </w:pPr>
     </w:p>
     <w:p>
       <w:pPr>
@@ -238,220 +1630,1209 @@
         <w:t>Rankschik de features van meest nuttig (1) naar minst nuttig (8)? Als je een feature niet opgemerkt hebt, mag je deze een score van -1 geven.</w:t>
       </w:r>
     </w:p>
-    <w:p>
-      <w:r>
-        <w:t>[    ]</w:t>
-      </w:r>
-      <w:r>
-        <w:tab/>
-        <w:t>Classificering door het schild icoon</w:t>
-      </w:r>
-    </w:p>
-    <w:p>
-      <w:pPr>
-        <w:pStyle w:val="Lijstalinea"/>
-        <w:numPr>
-          <w:ilvl w:val="0"/>
-          <w:numId w:val="7"/>
-        </w:numPr>
-      </w:pPr>
-      <w:r>
-        <w:t>2</w:t>
-      </w:r>
-      <w:r>
-        <w:t>, 3, 5</w:t>
-      </w:r>
-      <w:r>
-        <w:t>, 4, 5, 6, 6, 3, 3</w:t>
-      </w:r>
-    </w:p>
-    <w:p>
-      <w:r>
-        <w:t>[    ]</w:t>
-      </w:r>
-      <w:r>
-        <w:tab/>
-        <w:t>Weergave van soort node door de kleur</w:t>
-      </w:r>
-    </w:p>
-    <w:p>
-      <w:pPr>
-        <w:pStyle w:val="Lijstalinea"/>
-        <w:numPr>
-          <w:ilvl w:val="0"/>
-          <w:numId w:val="7"/>
-        </w:numPr>
-      </w:pPr>
-      <w:r>
-        <w:t>4</w:t>
-      </w:r>
-      <w:r>
-        <w:t>, 4, 4</w:t>
-      </w:r>
-      <w:r>
-        <w:t>, 1, 6, 4, 5, 8, 4</w:t>
-      </w:r>
-    </w:p>
-    <w:p>
-      <w:r>
-        <w:t>[    ]</w:t>
-      </w:r>
-      <w:r>
-        <w:tab/>
-        <w:t>Filtering op basis van de status van de node</w:t>
-      </w:r>
-    </w:p>
-    <w:p>
-      <w:pPr>
-        <w:pStyle w:val="Lijstalinea"/>
-        <w:numPr>
-          <w:ilvl w:val="0"/>
-          <w:numId w:val="7"/>
-        </w:numPr>
-      </w:pPr>
-      <w:r>
-        <w:t>1</w:t>
-      </w:r>
-      <w:r>
-        <w:t>, 1, 3</w:t>
-      </w:r>
-      <w:r>
-        <w:t>, 5, 1, 1, 2, 1, 1</w:t>
-      </w:r>
-    </w:p>
-    <w:p>
-      <w:r>
-        <w:t>[    ]</w:t>
-      </w:r>
-      <w:r>
-        <w:tab/>
-        <w:t>Notitie van aantal nodes per bepaalde status</w:t>
-      </w:r>
-    </w:p>
-    <w:p>
-      <w:pPr>
-        <w:pStyle w:val="Lijstalinea"/>
-        <w:numPr>
-          <w:ilvl w:val="0"/>
-          <w:numId w:val="7"/>
-        </w:numPr>
-      </w:pPr>
-      <w:r>
-        <w:t>5</w:t>
-      </w:r>
-      <w:r>
-        <w:t>, 8, 6</w:t>
-      </w:r>
-      <w:r>
-        <w:t>, 2, 2, 3, 1, 6, 2</w:t>
-      </w:r>
-    </w:p>
-    <w:p>
-      <w:r>
-        <w:t>[    ]</w:t>
-      </w:r>
-      <w:r>
-        <w:tab/>
-        <w:t>Rangschikking op basis van danger rating binnen de filtering</w:t>
-      </w:r>
-    </w:p>
-    <w:p>
-      <w:pPr>
-        <w:pStyle w:val="Lijstalinea"/>
-        <w:numPr>
-          <w:ilvl w:val="0"/>
-          <w:numId w:val="7"/>
-        </w:numPr>
-      </w:pPr>
-      <w:r>
-        <w:t>7</w:t>
-      </w:r>
-      <w:r>
-        <w:t>, 6</w:t>
-      </w:r>
-      <w:r>
-        <w:t>, 7, 3, 4, 5, 3, 5, 5</w:t>
-      </w:r>
-    </w:p>
-    <w:p>
-      <w:r>
-        <w:t>[    ]</w:t>
-      </w:r>
-      <w:r>
-        <w:tab/>
-        <w:t>Klikken van node in filtering balk highlight de node in de tree</w:t>
-      </w:r>
-    </w:p>
-    <w:p>
-      <w:pPr>
-        <w:pStyle w:val="Lijstalinea"/>
-        <w:numPr>
-          <w:ilvl w:val="0"/>
-          <w:numId w:val="7"/>
-        </w:numPr>
-      </w:pPr>
-      <w:r>
-        <w:t>3</w:t>
-      </w:r>
-      <w:r>
-        <w:t>, 5</w:t>
-      </w:r>
-      <w:r>
-        <w:t>, 8, 6, 3, -1, -1 (heeft dit wel eenmaal gebruikt), 4, 6</w:t>
-      </w:r>
-    </w:p>
-    <w:p>
-      <w:r>
-        <w:t>[    ]</w:t>
-      </w:r>
-      <w:r>
-        <w:tab/>
-        <w:t>Samenvatting van root tot aangeduide node</w:t>
-      </w:r>
-    </w:p>
-    <w:p>
-      <w:pPr>
-        <w:pStyle w:val="Lijstalinea"/>
-        <w:numPr>
-          <w:ilvl w:val="0"/>
-          <w:numId w:val="7"/>
-        </w:numPr>
-      </w:pPr>
-      <w:r>
-        <w:t>8</w:t>
-      </w:r>
-      <w:r>
-        <w:t>, 2</w:t>
-      </w:r>
-      <w:r>
-        <w:t>, -1, -1, 7, 2, 4, 2, 7</w:t>
-      </w:r>
-    </w:p>
-    <w:p>
-      <w:r>
-        <w:t>[    ]</w:t>
-      </w:r>
-      <w:r>
-        <w:tab/>
-        <w:t>Tooltips bij hoveren</w:t>
-      </w:r>
-    </w:p>
-    <w:p>
-      <w:pPr>
-        <w:pStyle w:val="Lijstalinea"/>
-        <w:numPr>
-          <w:ilvl w:val="0"/>
-          <w:numId w:val="7"/>
-        </w:numPr>
-      </w:pPr>
-      <w:r>
-        <w:t>6</w:t>
-      </w:r>
-      <w:r>
-        <w:t>, 7</w:t>
-      </w:r>
-      <w:r>
-        <w:t>, 2, 7, 8, -1, 7, 7, 8</w:t>
+    <w:tbl>
+      <w:tblPr>
+        <w:tblStyle w:val="Tabelraster"/>
+        <w:tblW w:w="8784" w:type="dxa"/>
+        <w:tblLook w:val="04A0" w:firstRow="1" w:lastRow="0" w:firstColumn="1" w:lastColumn="0" w:noHBand="0" w:noVBand="1"/>
+      </w:tblPr>
+      <w:tblGrid>
+        <w:gridCol w:w="3681"/>
+        <w:gridCol w:w="567"/>
+        <w:gridCol w:w="567"/>
+        <w:gridCol w:w="567"/>
+        <w:gridCol w:w="567"/>
+        <w:gridCol w:w="567"/>
+        <w:gridCol w:w="567"/>
+        <w:gridCol w:w="567"/>
+        <w:gridCol w:w="567"/>
+        <w:gridCol w:w="567"/>
+      </w:tblGrid>
+      <w:tr>
+        <w:tc>
+          <w:tcPr>
+            <w:tcW w:w="3681" w:type="dxa"/>
+          </w:tcPr>
+          <w:p/>
+        </w:tc>
+        <w:tc>
+          <w:tcPr>
+            <w:tcW w:w="567" w:type="dxa"/>
+          </w:tcPr>
+          <w:p>
+            <w:pPr>
+              <w:jc w:val="center"/>
+            </w:pPr>
+            <w:r>
+              <w:t>D1</w:t>
+            </w:r>
+          </w:p>
+        </w:tc>
+        <w:tc>
+          <w:tcPr>
+            <w:tcW w:w="567" w:type="dxa"/>
+          </w:tcPr>
+          <w:p>
+            <w:pPr>
+              <w:jc w:val="center"/>
+            </w:pPr>
+            <w:r>
+              <w:t>D2</w:t>
+            </w:r>
+          </w:p>
+        </w:tc>
+        <w:tc>
+          <w:tcPr>
+            <w:tcW w:w="567" w:type="dxa"/>
+          </w:tcPr>
+          <w:p>
+            <w:pPr>
+              <w:jc w:val="center"/>
+            </w:pPr>
+            <w:r>
+              <w:t>D3</w:t>
+            </w:r>
+          </w:p>
+        </w:tc>
+        <w:tc>
+          <w:tcPr>
+            <w:tcW w:w="567" w:type="dxa"/>
+          </w:tcPr>
+          <w:p>
+            <w:pPr>
+              <w:jc w:val="center"/>
+            </w:pPr>
+            <w:r>
+              <w:t>D4</w:t>
+            </w:r>
+          </w:p>
+        </w:tc>
+        <w:tc>
+          <w:tcPr>
+            <w:tcW w:w="567" w:type="dxa"/>
+          </w:tcPr>
+          <w:p>
+            <w:pPr>
+              <w:jc w:val="center"/>
+            </w:pPr>
+            <w:r>
+              <w:t>D5</w:t>
+            </w:r>
+          </w:p>
+        </w:tc>
+        <w:tc>
+          <w:tcPr>
+            <w:tcW w:w="567" w:type="dxa"/>
+          </w:tcPr>
+          <w:p>
+            <w:pPr>
+              <w:jc w:val="center"/>
+            </w:pPr>
+            <w:r>
+              <w:t>D6</w:t>
+            </w:r>
+          </w:p>
+        </w:tc>
+        <w:tc>
+          <w:tcPr>
+            <w:tcW w:w="567" w:type="dxa"/>
+          </w:tcPr>
+          <w:p>
+            <w:pPr>
+              <w:jc w:val="center"/>
+            </w:pPr>
+            <w:r>
+              <w:t>D7</w:t>
+            </w:r>
+          </w:p>
+        </w:tc>
+        <w:tc>
+          <w:tcPr>
+            <w:tcW w:w="567" w:type="dxa"/>
+          </w:tcPr>
+          <w:p>
+            <w:pPr>
+              <w:jc w:val="center"/>
+            </w:pPr>
+            <w:r>
+              <w:t>D8</w:t>
+            </w:r>
+          </w:p>
+        </w:tc>
+        <w:tc>
+          <w:tcPr>
+            <w:tcW w:w="567" w:type="dxa"/>
+          </w:tcPr>
+          <w:p>
+            <w:pPr>
+              <w:jc w:val="center"/>
+            </w:pPr>
+            <w:r>
+              <w:t>D9</w:t>
+            </w:r>
+          </w:p>
+        </w:tc>
+      </w:tr>
+      <w:tr>
+        <w:trPr>
+          <w:trHeight w:val="454"/>
+        </w:trPr>
+        <w:tc>
+          <w:tcPr>
+            <w:tcW w:w="3681" w:type="dxa"/>
+          </w:tcPr>
+          <w:p>
+            <w:r>
+              <w:t>Classificering door het schild icoon</w:t>
+            </w:r>
+          </w:p>
+        </w:tc>
+        <w:tc>
+          <w:tcPr>
+            <w:tcW w:w="567" w:type="dxa"/>
+          </w:tcPr>
+          <w:p>
+            <w:pPr>
+              <w:jc w:val="center"/>
+            </w:pPr>
+            <w:r>
+              <w:t>2</w:t>
+            </w:r>
+          </w:p>
+        </w:tc>
+        <w:tc>
+          <w:tcPr>
+            <w:tcW w:w="567" w:type="dxa"/>
+          </w:tcPr>
+          <w:p>
+            <w:pPr>
+              <w:jc w:val="center"/>
+            </w:pPr>
+            <w:r>
+              <w:t>3</w:t>
+            </w:r>
+          </w:p>
+        </w:tc>
+        <w:tc>
+          <w:tcPr>
+            <w:tcW w:w="567" w:type="dxa"/>
+          </w:tcPr>
+          <w:p>
+            <w:pPr>
+              <w:jc w:val="center"/>
+            </w:pPr>
+            <w:r>
+              <w:t>5</w:t>
+            </w:r>
+          </w:p>
+        </w:tc>
+        <w:tc>
+          <w:tcPr>
+            <w:tcW w:w="567" w:type="dxa"/>
+          </w:tcPr>
+          <w:p>
+            <w:pPr>
+              <w:jc w:val="center"/>
+            </w:pPr>
+            <w:r>
+              <w:t>4</w:t>
+            </w:r>
+          </w:p>
+        </w:tc>
+        <w:tc>
+          <w:tcPr>
+            <w:tcW w:w="567" w:type="dxa"/>
+          </w:tcPr>
+          <w:p>
+            <w:pPr>
+              <w:jc w:val="center"/>
+            </w:pPr>
+            <w:r>
+              <w:t>5</w:t>
+            </w:r>
+          </w:p>
+        </w:tc>
+        <w:tc>
+          <w:tcPr>
+            <w:tcW w:w="567" w:type="dxa"/>
+          </w:tcPr>
+          <w:p>
+            <w:pPr>
+              <w:jc w:val="center"/>
+            </w:pPr>
+            <w:r>
+              <w:t>6</w:t>
+            </w:r>
+          </w:p>
+        </w:tc>
+        <w:tc>
+          <w:tcPr>
+            <w:tcW w:w="567" w:type="dxa"/>
+          </w:tcPr>
+          <w:p>
+            <w:pPr>
+              <w:jc w:val="center"/>
+            </w:pPr>
+            <w:r>
+              <w:t>6</w:t>
+            </w:r>
+          </w:p>
+        </w:tc>
+        <w:tc>
+          <w:tcPr>
+            <w:tcW w:w="567" w:type="dxa"/>
+          </w:tcPr>
+          <w:p>
+            <w:pPr>
+              <w:jc w:val="center"/>
+            </w:pPr>
+            <w:r>
+              <w:t>3</w:t>
+            </w:r>
+          </w:p>
+        </w:tc>
+        <w:tc>
+          <w:tcPr>
+            <w:tcW w:w="567" w:type="dxa"/>
+          </w:tcPr>
+          <w:p>
+            <w:pPr>
+              <w:jc w:val="center"/>
+            </w:pPr>
+            <w:r>
+              <w:t>3</w:t>
+            </w:r>
+          </w:p>
+        </w:tc>
+      </w:tr>
+      <w:tr>
+        <w:trPr>
+          <w:trHeight w:val="454"/>
+        </w:trPr>
+        <w:tc>
+          <w:tcPr>
+            <w:tcW w:w="3681" w:type="dxa"/>
+          </w:tcPr>
+          <w:p>
+            <w:r>
+              <w:t>Weergave van soort node door de kleur</w:t>
+            </w:r>
+          </w:p>
+        </w:tc>
+        <w:tc>
+          <w:tcPr>
+            <w:tcW w:w="567" w:type="dxa"/>
+          </w:tcPr>
+          <w:p>
+            <w:pPr>
+              <w:jc w:val="center"/>
+            </w:pPr>
+            <w:r>
+              <w:t>5</w:t>
+            </w:r>
+          </w:p>
+        </w:tc>
+        <w:tc>
+          <w:tcPr>
+            <w:tcW w:w="567" w:type="dxa"/>
+          </w:tcPr>
+          <w:p>
+            <w:pPr>
+              <w:jc w:val="center"/>
+            </w:pPr>
+            <w:r>
+              <w:t>4</w:t>
+            </w:r>
+          </w:p>
+        </w:tc>
+        <w:tc>
+          <w:tcPr>
+            <w:tcW w:w="567" w:type="dxa"/>
+          </w:tcPr>
+          <w:p>
+            <w:pPr>
+              <w:jc w:val="center"/>
+            </w:pPr>
+            <w:r>
+              <w:t>4</w:t>
+            </w:r>
+          </w:p>
+        </w:tc>
+        <w:tc>
+          <w:tcPr>
+            <w:tcW w:w="567" w:type="dxa"/>
+          </w:tcPr>
+          <w:p>
+            <w:pPr>
+              <w:jc w:val="center"/>
+            </w:pPr>
+            <w:r>
+              <w:t>1</w:t>
+            </w:r>
+          </w:p>
+        </w:tc>
+        <w:tc>
+          <w:tcPr>
+            <w:tcW w:w="567" w:type="dxa"/>
+          </w:tcPr>
+          <w:p>
+            <w:pPr>
+              <w:jc w:val="center"/>
+            </w:pPr>
+            <w:r>
+              <w:t>6</w:t>
+            </w:r>
+          </w:p>
+        </w:tc>
+        <w:tc>
+          <w:tcPr>
+            <w:tcW w:w="567" w:type="dxa"/>
+          </w:tcPr>
+          <w:p>
+            <w:pPr>
+              <w:jc w:val="center"/>
+            </w:pPr>
+            <w:r>
+              <w:t>4</w:t>
+            </w:r>
+          </w:p>
+        </w:tc>
+        <w:tc>
+          <w:tcPr>
+            <w:tcW w:w="567" w:type="dxa"/>
+          </w:tcPr>
+          <w:p>
+            <w:pPr>
+              <w:jc w:val="center"/>
+            </w:pPr>
+            <w:r>
+              <w:t>5</w:t>
+            </w:r>
+          </w:p>
+        </w:tc>
+        <w:tc>
+          <w:tcPr>
+            <w:tcW w:w="567" w:type="dxa"/>
+          </w:tcPr>
+          <w:p>
+            <w:pPr>
+              <w:jc w:val="center"/>
+            </w:pPr>
+            <w:r>
+              <w:t>8</w:t>
+            </w:r>
+          </w:p>
+        </w:tc>
+        <w:tc>
+          <w:tcPr>
+            <w:tcW w:w="567" w:type="dxa"/>
+          </w:tcPr>
+          <w:p>
+            <w:pPr>
+              <w:jc w:val="center"/>
+            </w:pPr>
+            <w:r>
+              <w:t>4</w:t>
+            </w:r>
+          </w:p>
+        </w:tc>
+      </w:tr>
+      <w:tr>
+        <w:trPr>
+          <w:trHeight w:val="454"/>
+        </w:trPr>
+        <w:tc>
+          <w:tcPr>
+            <w:tcW w:w="3681" w:type="dxa"/>
+          </w:tcPr>
+          <w:p>
+            <w:r>
+              <w:t>Filtering op basis van de status van de node</w:t>
+            </w:r>
+          </w:p>
+        </w:tc>
+        <w:tc>
+          <w:tcPr>
+            <w:tcW w:w="567" w:type="dxa"/>
+          </w:tcPr>
+          <w:p>
+            <w:pPr>
+              <w:jc w:val="center"/>
+            </w:pPr>
+            <w:r>
+              <w:t>1</w:t>
+            </w:r>
+          </w:p>
+        </w:tc>
+        <w:tc>
+          <w:tcPr>
+            <w:tcW w:w="567" w:type="dxa"/>
+          </w:tcPr>
+          <w:p>
+            <w:pPr>
+              <w:jc w:val="center"/>
+            </w:pPr>
+            <w:r>
+              <w:t>1</w:t>
+            </w:r>
+          </w:p>
+        </w:tc>
+        <w:tc>
+          <w:tcPr>
+            <w:tcW w:w="567" w:type="dxa"/>
+          </w:tcPr>
+          <w:p>
+            <w:pPr>
+              <w:jc w:val="center"/>
+            </w:pPr>
+            <w:r>
+              <w:t>3</w:t>
+            </w:r>
+          </w:p>
+        </w:tc>
+        <w:tc>
+          <w:tcPr>
+            <w:tcW w:w="567" w:type="dxa"/>
+          </w:tcPr>
+          <w:p>
+            <w:pPr>
+              <w:jc w:val="center"/>
+            </w:pPr>
+            <w:r>
+              <w:t>5</w:t>
+            </w:r>
+          </w:p>
+        </w:tc>
+        <w:tc>
+          <w:tcPr>
+            <w:tcW w:w="567" w:type="dxa"/>
+          </w:tcPr>
+          <w:p>
+            <w:pPr>
+              <w:jc w:val="center"/>
+            </w:pPr>
+            <w:r>
+              <w:t>1</w:t>
+            </w:r>
+          </w:p>
+        </w:tc>
+        <w:tc>
+          <w:tcPr>
+            <w:tcW w:w="567" w:type="dxa"/>
+          </w:tcPr>
+          <w:p>
+            <w:pPr>
+              <w:jc w:val="center"/>
+            </w:pPr>
+            <w:r>
+              <w:t>1</w:t>
+            </w:r>
+          </w:p>
+        </w:tc>
+        <w:tc>
+          <w:tcPr>
+            <w:tcW w:w="567" w:type="dxa"/>
+          </w:tcPr>
+          <w:p>
+            <w:pPr>
+              <w:jc w:val="center"/>
+            </w:pPr>
+            <w:r>
+              <w:t>2</w:t>
+            </w:r>
+          </w:p>
+        </w:tc>
+        <w:tc>
+          <w:tcPr>
+            <w:tcW w:w="567" w:type="dxa"/>
+          </w:tcPr>
+          <w:p>
+            <w:pPr>
+              <w:jc w:val="center"/>
+            </w:pPr>
+            <w:r>
+              <w:t>1</w:t>
+            </w:r>
+          </w:p>
+        </w:tc>
+        <w:tc>
+          <w:tcPr>
+            <w:tcW w:w="567" w:type="dxa"/>
+          </w:tcPr>
+          <w:p>
+            <w:pPr>
+              <w:jc w:val="center"/>
+            </w:pPr>
+            <w:r>
+              <w:t>1</w:t>
+            </w:r>
+          </w:p>
+        </w:tc>
+      </w:tr>
+      <w:tr>
+        <w:trPr>
+          <w:trHeight w:val="454"/>
+        </w:trPr>
+        <w:tc>
+          <w:tcPr>
+            <w:tcW w:w="3681" w:type="dxa"/>
+          </w:tcPr>
+          <w:p>
+            <w:r>
+              <w:t>Notitie van aantal nodes per bepaalde status</w:t>
+            </w:r>
+          </w:p>
+        </w:tc>
+        <w:tc>
+          <w:tcPr>
+            <w:tcW w:w="567" w:type="dxa"/>
+          </w:tcPr>
+          <w:p>
+            <w:pPr>
+              <w:jc w:val="center"/>
+            </w:pPr>
+            <w:r>
+              <w:t>6</w:t>
+            </w:r>
+          </w:p>
+        </w:tc>
+        <w:tc>
+          <w:tcPr>
+            <w:tcW w:w="567" w:type="dxa"/>
+          </w:tcPr>
+          <w:p>
+            <w:pPr>
+              <w:jc w:val="center"/>
+            </w:pPr>
+            <w:r>
+              <w:t>8</w:t>
+            </w:r>
+          </w:p>
+        </w:tc>
+        <w:tc>
+          <w:tcPr>
+            <w:tcW w:w="567" w:type="dxa"/>
+          </w:tcPr>
+          <w:p>
+            <w:pPr>
+              <w:jc w:val="center"/>
+            </w:pPr>
+            <w:r>
+              <w:t>6</w:t>
+            </w:r>
+          </w:p>
+        </w:tc>
+        <w:tc>
+          <w:tcPr>
+            <w:tcW w:w="567" w:type="dxa"/>
+          </w:tcPr>
+          <w:p>
+            <w:pPr>
+              <w:jc w:val="center"/>
+            </w:pPr>
+            <w:r>
+              <w:t>2</w:t>
+            </w:r>
+          </w:p>
+        </w:tc>
+        <w:tc>
+          <w:tcPr>
+            <w:tcW w:w="567" w:type="dxa"/>
+          </w:tcPr>
+          <w:p>
+            <w:pPr>
+              <w:jc w:val="center"/>
+            </w:pPr>
+            <w:r>
+              <w:t>2</w:t>
+            </w:r>
+          </w:p>
+        </w:tc>
+        <w:tc>
+          <w:tcPr>
+            <w:tcW w:w="567" w:type="dxa"/>
+          </w:tcPr>
+          <w:p>
+            <w:pPr>
+              <w:jc w:val="center"/>
+            </w:pPr>
+            <w:r>
+              <w:t>3</w:t>
+            </w:r>
+          </w:p>
+        </w:tc>
+        <w:tc>
+          <w:tcPr>
+            <w:tcW w:w="567" w:type="dxa"/>
+          </w:tcPr>
+          <w:p>
+            <w:pPr>
+              <w:jc w:val="center"/>
+            </w:pPr>
+            <w:r>
+              <w:t>1</w:t>
+            </w:r>
+          </w:p>
+        </w:tc>
+        <w:tc>
+          <w:tcPr>
+            <w:tcW w:w="567" w:type="dxa"/>
+          </w:tcPr>
+          <w:p>
+            <w:pPr>
+              <w:jc w:val="center"/>
+            </w:pPr>
+            <w:r>
+              <w:t>6</w:t>
+            </w:r>
+          </w:p>
+        </w:tc>
+        <w:tc>
+          <w:tcPr>
+            <w:tcW w:w="567" w:type="dxa"/>
+          </w:tcPr>
+          <w:p>
+            <w:pPr>
+              <w:jc w:val="center"/>
+            </w:pPr>
+            <w:r>
+              <w:t>2</w:t>
+            </w:r>
+          </w:p>
+        </w:tc>
+      </w:tr>
+      <w:tr>
+        <w:trPr>
+          <w:trHeight w:val="454"/>
+        </w:trPr>
+        <w:tc>
+          <w:tcPr>
+            <w:tcW w:w="3681" w:type="dxa"/>
+          </w:tcPr>
+          <w:p>
+            <w:r>
+              <w:t>Rangschikking op basis van danger rating binnen de filtering</w:t>
+            </w:r>
+          </w:p>
+        </w:tc>
+        <w:tc>
+          <w:tcPr>
+            <w:tcW w:w="567" w:type="dxa"/>
+          </w:tcPr>
+          <w:p>
+            <w:pPr>
+              <w:jc w:val="center"/>
+            </w:pPr>
+            <w:r>
+              <w:t>7</w:t>
+            </w:r>
+          </w:p>
+        </w:tc>
+        <w:tc>
+          <w:tcPr>
+            <w:tcW w:w="567" w:type="dxa"/>
+          </w:tcPr>
+          <w:p>
+            <w:pPr>
+              <w:jc w:val="center"/>
+            </w:pPr>
+            <w:r>
+              <w:t>6</w:t>
+            </w:r>
+          </w:p>
+        </w:tc>
+        <w:tc>
+          <w:tcPr>
+            <w:tcW w:w="567" w:type="dxa"/>
+          </w:tcPr>
+          <w:p>
+            <w:pPr>
+              <w:jc w:val="center"/>
+            </w:pPr>
+            <w:r>
+              <w:t>7</w:t>
+            </w:r>
+          </w:p>
+        </w:tc>
+        <w:tc>
+          <w:tcPr>
+            <w:tcW w:w="567" w:type="dxa"/>
+          </w:tcPr>
+          <w:p>
+            <w:pPr>
+              <w:jc w:val="center"/>
+            </w:pPr>
+            <w:r>
+              <w:t>3</w:t>
+            </w:r>
+          </w:p>
+        </w:tc>
+        <w:tc>
+          <w:tcPr>
+            <w:tcW w:w="567" w:type="dxa"/>
+          </w:tcPr>
+          <w:p>
+            <w:pPr>
+              <w:jc w:val="center"/>
+            </w:pPr>
+            <w:r>
+              <w:t>4</w:t>
+            </w:r>
+          </w:p>
+        </w:tc>
+        <w:tc>
+          <w:tcPr>
+            <w:tcW w:w="567" w:type="dxa"/>
+          </w:tcPr>
+          <w:p>
+            <w:pPr>
+              <w:jc w:val="center"/>
+            </w:pPr>
+            <w:r>
+              <w:t>5</w:t>
+            </w:r>
+          </w:p>
+        </w:tc>
+        <w:tc>
+          <w:tcPr>
+            <w:tcW w:w="567" w:type="dxa"/>
+          </w:tcPr>
+          <w:p>
+            <w:pPr>
+              <w:jc w:val="center"/>
+            </w:pPr>
+            <w:r>
+              <w:t>3</w:t>
+            </w:r>
+          </w:p>
+        </w:tc>
+        <w:tc>
+          <w:tcPr>
+            <w:tcW w:w="567" w:type="dxa"/>
+          </w:tcPr>
+          <w:p>
+            <w:pPr>
+              <w:jc w:val="center"/>
+            </w:pPr>
+            <w:r>
+              <w:t>5</w:t>
+            </w:r>
+          </w:p>
+        </w:tc>
+        <w:tc>
+          <w:tcPr>
+            <w:tcW w:w="567" w:type="dxa"/>
+          </w:tcPr>
+          <w:p>
+            <w:pPr>
+              <w:jc w:val="center"/>
+            </w:pPr>
+            <w:r>
+              <w:t>5</w:t>
+            </w:r>
+          </w:p>
+        </w:tc>
+      </w:tr>
+      <w:tr>
+        <w:trPr>
+          <w:trHeight w:val="454"/>
+        </w:trPr>
+        <w:tc>
+          <w:tcPr>
+            <w:tcW w:w="3681" w:type="dxa"/>
+          </w:tcPr>
+          <w:p>
+            <w:r>
+              <w:t>Klikken van node in filtering balk highlight de node in de tree</w:t>
+            </w:r>
+          </w:p>
+        </w:tc>
+        <w:tc>
+          <w:tcPr>
+            <w:tcW w:w="567" w:type="dxa"/>
+          </w:tcPr>
+          <w:p>
+            <w:pPr>
+              <w:jc w:val="center"/>
+            </w:pPr>
+            <w:r>
+              <w:t>3</w:t>
+            </w:r>
+          </w:p>
+        </w:tc>
+        <w:tc>
+          <w:tcPr>
+            <w:tcW w:w="567" w:type="dxa"/>
+          </w:tcPr>
+          <w:p>
+            <w:pPr>
+              <w:jc w:val="center"/>
+            </w:pPr>
+            <w:r>
+              <w:t>5</w:t>
+            </w:r>
+          </w:p>
+        </w:tc>
+        <w:tc>
+          <w:tcPr>
+            <w:tcW w:w="567" w:type="dxa"/>
+          </w:tcPr>
+          <w:p>
+            <w:pPr>
+              <w:jc w:val="center"/>
+            </w:pPr>
+            <w:r>
+              <w:t>8</w:t>
+            </w:r>
+          </w:p>
+        </w:tc>
+        <w:tc>
+          <w:tcPr>
+            <w:tcW w:w="567" w:type="dxa"/>
+          </w:tcPr>
+          <w:p>
+            <w:pPr>
+              <w:jc w:val="center"/>
+            </w:pPr>
+            <w:r>
+              <w:t>6</w:t>
+            </w:r>
+          </w:p>
+        </w:tc>
+        <w:tc>
+          <w:tcPr>
+            <w:tcW w:w="567" w:type="dxa"/>
+          </w:tcPr>
+          <w:p>
+            <w:pPr>
+              <w:jc w:val="center"/>
+            </w:pPr>
+            <w:r>
+              <w:t>3</w:t>
+            </w:r>
+          </w:p>
+        </w:tc>
+        <w:tc>
+          <w:tcPr>
+            <w:tcW w:w="567" w:type="dxa"/>
+          </w:tcPr>
+          <w:p>
+            <w:pPr>
+              <w:jc w:val="center"/>
+            </w:pPr>
+            <w:r>
+              <w:t>-1</w:t>
+            </w:r>
+          </w:p>
+        </w:tc>
+        <w:tc>
+          <w:tcPr>
+            <w:tcW w:w="567" w:type="dxa"/>
+          </w:tcPr>
+          <w:p>
+            <w:pPr>
+              <w:jc w:val="center"/>
+            </w:pPr>
+            <w:r>
+              <w:t>-1</w:t>
+            </w:r>
+          </w:p>
+        </w:tc>
+        <w:tc>
+          <w:tcPr>
+            <w:tcW w:w="567" w:type="dxa"/>
+          </w:tcPr>
+          <w:p>
+            <w:pPr>
+              <w:jc w:val="center"/>
+            </w:pPr>
+            <w:r>
+              <w:t>4</w:t>
+            </w:r>
+          </w:p>
+        </w:tc>
+        <w:tc>
+          <w:tcPr>
+            <w:tcW w:w="567" w:type="dxa"/>
+          </w:tcPr>
+          <w:p>
+            <w:pPr>
+              <w:jc w:val="center"/>
+            </w:pPr>
+            <w:r>
+              <w:t>6</w:t>
+            </w:r>
+          </w:p>
+        </w:tc>
+      </w:tr>
+      <w:tr>
+        <w:trPr>
+          <w:trHeight w:val="454"/>
+        </w:trPr>
+        <w:tc>
+          <w:tcPr>
+            <w:tcW w:w="3681" w:type="dxa"/>
+          </w:tcPr>
+          <w:p>
+            <w:r>
+              <w:t>Samenvatting van root tot aangeduide node</w:t>
+            </w:r>
+          </w:p>
+        </w:tc>
+        <w:tc>
+          <w:tcPr>
+            <w:tcW w:w="567" w:type="dxa"/>
+          </w:tcPr>
+          <w:p>
+            <w:pPr>
+              <w:jc w:val="center"/>
+            </w:pPr>
+            <w:r>
+              <w:t>8</w:t>
+            </w:r>
+          </w:p>
+        </w:tc>
+        <w:tc>
+          <w:tcPr>
+            <w:tcW w:w="567" w:type="dxa"/>
+          </w:tcPr>
+          <w:p>
+            <w:pPr>
+              <w:jc w:val="center"/>
+            </w:pPr>
+            <w:r>
+              <w:t>2</w:t>
+            </w:r>
+          </w:p>
+        </w:tc>
+        <w:tc>
+          <w:tcPr>
+            <w:tcW w:w="567" w:type="dxa"/>
+          </w:tcPr>
+          <w:p>
+            <w:pPr>
+              <w:jc w:val="center"/>
+            </w:pPr>
+            <w:r>
+              <w:t>-1</w:t>
+            </w:r>
+          </w:p>
+        </w:tc>
+        <w:tc>
+          <w:tcPr>
+            <w:tcW w:w="567" w:type="dxa"/>
+          </w:tcPr>
+          <w:p>
+            <w:pPr>
+              <w:jc w:val="center"/>
+            </w:pPr>
+            <w:r>
+              <w:t>-1</w:t>
+            </w:r>
+          </w:p>
+        </w:tc>
+        <w:tc>
+          <w:tcPr>
+            <w:tcW w:w="567" w:type="dxa"/>
+          </w:tcPr>
+          <w:p>
+            <w:pPr>
+              <w:jc w:val="center"/>
+            </w:pPr>
+            <w:r>
+              <w:t>7</w:t>
+            </w:r>
+          </w:p>
+        </w:tc>
+        <w:tc>
+          <w:tcPr>
+            <w:tcW w:w="567" w:type="dxa"/>
+          </w:tcPr>
+          <w:p>
+            <w:pPr>
+              <w:jc w:val="center"/>
+            </w:pPr>
+            <w:r>
+              <w:t>2</w:t>
+            </w:r>
+          </w:p>
+        </w:tc>
+        <w:tc>
+          <w:tcPr>
+            <w:tcW w:w="567" w:type="dxa"/>
+          </w:tcPr>
+          <w:p>
+            <w:pPr>
+              <w:jc w:val="center"/>
+            </w:pPr>
+            <w:r>
+              <w:t>4</w:t>
+            </w:r>
+          </w:p>
+        </w:tc>
+        <w:tc>
+          <w:tcPr>
+            <w:tcW w:w="567" w:type="dxa"/>
+          </w:tcPr>
+          <w:p>
+            <w:pPr>
+              <w:jc w:val="center"/>
+            </w:pPr>
+            <w:r>
+              <w:t>2</w:t>
+            </w:r>
+          </w:p>
+        </w:tc>
+        <w:tc>
+          <w:tcPr>
+            <w:tcW w:w="567" w:type="dxa"/>
+          </w:tcPr>
+          <w:p>
+            <w:pPr>
+              <w:jc w:val="center"/>
+            </w:pPr>
+            <w:r>
+              <w:t>7</w:t>
+            </w:r>
+          </w:p>
+        </w:tc>
+      </w:tr>
+      <w:tr>
+        <w:trPr>
+          <w:trHeight w:val="454"/>
+        </w:trPr>
+        <w:tc>
+          <w:tcPr>
+            <w:tcW w:w="3681" w:type="dxa"/>
+          </w:tcPr>
+          <w:p>
+            <w:r>
+              <w:t>Tooltips bij hoveren</w:t>
+            </w:r>
+          </w:p>
+        </w:tc>
+        <w:tc>
+          <w:tcPr>
+            <w:tcW w:w="567" w:type="dxa"/>
+          </w:tcPr>
+          <w:p>
+            <w:pPr>
+              <w:jc w:val="center"/>
+            </w:pPr>
+            <w:r>
+              <w:t>4</w:t>
+            </w:r>
+          </w:p>
+        </w:tc>
+        <w:tc>
+          <w:tcPr>
+            <w:tcW w:w="567" w:type="dxa"/>
+          </w:tcPr>
+          <w:p>
+            <w:pPr>
+              <w:jc w:val="center"/>
+            </w:pPr>
+            <w:r>
+              <w:t>7</w:t>
+            </w:r>
+          </w:p>
+        </w:tc>
+        <w:tc>
+          <w:tcPr>
+            <w:tcW w:w="567" w:type="dxa"/>
+          </w:tcPr>
+          <w:p>
+            <w:pPr>
+              <w:jc w:val="center"/>
+            </w:pPr>
+            <w:r>
+              <w:t>2</w:t>
+            </w:r>
+          </w:p>
+        </w:tc>
+        <w:tc>
+          <w:tcPr>
+            <w:tcW w:w="567" w:type="dxa"/>
+          </w:tcPr>
+          <w:p>
+            <w:pPr>
+              <w:jc w:val="center"/>
+            </w:pPr>
+            <w:r>
+              <w:t>7</w:t>
+            </w:r>
+          </w:p>
+        </w:tc>
+        <w:tc>
+          <w:tcPr>
+            <w:tcW w:w="567" w:type="dxa"/>
+          </w:tcPr>
+          <w:p>
+            <w:pPr>
+              <w:jc w:val="center"/>
+            </w:pPr>
+            <w:r>
+              <w:t>8</w:t>
+            </w:r>
+          </w:p>
+        </w:tc>
+        <w:tc>
+          <w:tcPr>
+            <w:tcW w:w="567" w:type="dxa"/>
+          </w:tcPr>
+          <w:p>
+            <w:pPr>
+              <w:jc w:val="center"/>
+            </w:pPr>
+            <w:r>
+              <w:t>-1</w:t>
+            </w:r>
+          </w:p>
+        </w:tc>
+        <w:tc>
+          <w:tcPr>
+            <w:tcW w:w="567" w:type="dxa"/>
+          </w:tcPr>
+          <w:p>
+            <w:pPr>
+              <w:jc w:val="center"/>
+            </w:pPr>
+            <w:r>
+              <w:t>7</w:t>
+            </w:r>
+          </w:p>
+        </w:tc>
+        <w:tc>
+          <w:tcPr>
+            <w:tcW w:w="567" w:type="dxa"/>
+          </w:tcPr>
+          <w:p>
+            <w:pPr>
+              <w:jc w:val="center"/>
+            </w:pPr>
+            <w:r>
+              <w:t>7</w:t>
+            </w:r>
+          </w:p>
+        </w:tc>
+        <w:tc>
+          <w:tcPr>
+            <w:tcW w:w="567" w:type="dxa"/>
+          </w:tcPr>
+          <w:p>
+            <w:pPr>
+              <w:jc w:val="center"/>
+            </w:pPr>
+            <w:r>
+              <w:t>8</w:t>
+            </w:r>
+          </w:p>
+        </w:tc>
+      </w:tr>
+    </w:tbl>
+    <w:p>
+      <w:r>
+        <w:br w:type="page"/>
       </w:r>
     </w:p>
     <w:p>
@@ -463,156 +2844,167 @@
         </w:numPr>
       </w:pPr>
       <w:r>
+        <w:lastRenderedPageBreak/>
         <w:t>Welke onderdelen van versie 1/versie 2 van de software zouden volgens jou verbeterd kunnen worden?</w:t>
       </w:r>
     </w:p>
     <w:p>
       <w:pPr>
-        <w:numPr>
-          <w:ilvl w:val="1"/>
-          <w:numId w:val="1"/>
-        </w:numPr>
-      </w:pPr>
+        <w:ind w:firstLine="708"/>
+      </w:pPr>
+      <w:r>
+        <w:t xml:space="preserve">D1. </w:t>
+      </w:r>
       <w:r>
         <w:t>Meer op het scherm doen passen</w:t>
       </w:r>
     </w:p>
     <w:p>
       <w:pPr>
-        <w:numPr>
-          <w:ilvl w:val="1"/>
-          <w:numId w:val="1"/>
-        </w:numPr>
-      </w:pPr>
-      <w:r>
-        <w:lastRenderedPageBreak/>
-        <w:t xml:space="preserve">Manier om nodes dicht te klappen </w:t>
-      </w:r>
+        <w:ind w:firstLine="708"/>
+      </w:pPr>
+      <w:r>
+        <w:t xml:space="preserve">D1. </w:t>
+      </w:r>
+      <w:r>
+        <w:t>Manier om nodes dicht te klappen</w:t>
+      </w:r>
+    </w:p>
+    <w:p>
+      <w:pPr>
+        <w:ind w:firstLine="708"/>
+      </w:pPr>
+      <w:r>
+        <w:t xml:space="preserve">D2. </w:t>
+      </w:r>
+      <w:r>
+        <w:t>Tooltips bij symbolen (bij veranderen van status)</w:t>
+      </w:r>
+    </w:p>
+    <w:p>
+      <w:pPr>
+        <w:ind w:firstLine="708"/>
+      </w:pPr>
+      <w:r>
+        <w:t>D2. Searchbar kan meer context geven (bv. aantal hits)</w:t>
+      </w:r>
+    </w:p>
+    <w:p>
+      <w:pPr>
+        <w:ind w:firstLine="708"/>
+      </w:pPr>
+      <w:r>
+        <w:t>D3. Knop om children van een node dicht te klappen</w:t>
+      </w:r>
+    </w:p>
+    <w:p>
+      <w:pPr>
+        <w:ind w:firstLine="708"/>
+      </w:pPr>
+      <w:r>
+        <w:t>D4. Eventueel root tree bovenaan in het midden zetten i.p.v. in de linkerhoek</w:t>
+      </w:r>
+    </w:p>
+    <w:p>
+      <w:pPr>
+        <w:ind w:firstLine="708"/>
+      </w:pPr>
+      <w:r>
+        <w:t>D5. Custom statussen mogelijk maken</w:t>
+      </w:r>
+    </w:p>
+    <w:p>
+      <w:pPr>
+        <w:ind w:firstLine="708"/>
+      </w:pPr>
       <w:r>
         <w:rPr>
-          <w:color w:val="4EA72E" w:themeColor="accent6"/>
+          <w:lang w:val="en-US"/>
         </w:rPr>
-        <w:t>(Is er al)</w:t>
-      </w:r>
-    </w:p>
-    <w:p>
-      <w:pPr>
-        <w:numPr>
-          <w:ilvl w:val="1"/>
-          <w:numId w:val="1"/>
-        </w:numPr>
-      </w:pPr>
-      <w:r>
-        <w:t>Tooltips bij symbolen (bij veranderen van status)</w:t>
-      </w:r>
-    </w:p>
-    <w:p>
-      <w:pPr>
-        <w:numPr>
-          <w:ilvl w:val="1"/>
-          <w:numId w:val="1"/>
-        </w:numPr>
-      </w:pPr>
-      <w:r>
-        <w:t>Minder marge bij inspringen en rondom nodes</w:t>
-      </w:r>
-    </w:p>
-    <w:p>
-      <w:pPr>
-        <w:numPr>
-          <w:ilvl w:val="1"/>
-          <w:numId w:val="1"/>
-        </w:numPr>
-      </w:pPr>
-      <w:r>
-        <w:t>Inklappen van nodes kan intuïtiever (bv zoals redit)</w:t>
-      </w:r>
-    </w:p>
-    <w:p>
-      <w:pPr>
-        <w:numPr>
-          <w:ilvl w:val="1"/>
-          <w:numId w:val="1"/>
-        </w:numPr>
-      </w:pPr>
-      <w:r>
-        <w:t>Children van een node kunnen dichtklappen</w:t>
-      </w:r>
-      <w:r>
-        <w:t xml:space="preserve"> met een enkele knop</w:t>
-      </w:r>
-    </w:p>
-    <w:p>
-      <w:pPr>
-        <w:numPr>
-          <w:ilvl w:val="1"/>
-          <w:numId w:val="1"/>
-        </w:numPr>
-      </w:pPr>
-      <w:r>
-        <w:t>Toevoeging van custom status mogelijk maken</w:t>
-      </w:r>
-    </w:p>
-    <w:p>
-      <w:pPr>
-        <w:numPr>
-          <w:ilvl w:val="1"/>
-          <w:numId w:val="1"/>
-        </w:numPr>
-      </w:pPr>
-      <w:r>
-        <w:t>Info button beweegt na hoveren over node</w:t>
-      </w:r>
-    </w:p>
-    <w:p>
-      <w:pPr>
-        <w:numPr>
-          <w:ilvl w:val="1"/>
-          <w:numId w:val="1"/>
-        </w:numPr>
-      </w:pPr>
-      <w:r>
-        <w:t>Pijlknoppen bij searchfuntion om te springen tussen nodes ipv enkel de enter</w:t>
-      </w:r>
-    </w:p>
-    <w:p>
-      <w:pPr>
-        <w:numPr>
-          <w:ilvl w:val="1"/>
-          <w:numId w:val="1"/>
-        </w:numPr>
-      </w:pPr>
-      <w:r>
-        <w:t>Enable/disable collapse of expand buttons om status nog duidelijker weer te geve</w:t>
-      </w:r>
-      <w:r>
-        <w:t>n</w:t>
-      </w:r>
-    </w:p>
-    <w:p>
-      <w:pPr>
-        <w:numPr>
-          <w:ilvl w:val="1"/>
-          <w:numId w:val="1"/>
-        </w:numPr>
-      </w:pPr>
-      <w:r>
-        <w:t>Cancellen van perongeluk gemaakt nodes buiten enkel de trashbin</w:t>
-      </w:r>
-    </w:p>
-    <w:p>
-      <w:pPr>
-        <w:numPr>
-          <w:ilvl w:val="1"/>
-          <w:numId w:val="1"/>
-        </w:numPr>
-      </w:pPr>
-      <w:r>
-        <w:t>Cijfer van aantal per classificering ook weergeven in de geopende filterbalk</w:t>
-      </w:r>
-      <w:r>
-        <w:br/>
-      </w:r>
+        <w:t xml:space="preserve">D6. UI manier van clean &amp; simpel design (bv. </w:t>
+      </w:r>
+      <w:r>
+        <w:t xml:space="preserve">Info button beweegt </w:t>
+      </w:r>
+      <w:r>
+        <w:t>na hover)</w:t>
+      </w:r>
+    </w:p>
+    <w:p>
+      <w:pPr>
+        <w:ind w:firstLine="708"/>
+      </w:pPr>
+      <w:r>
+        <w:t>D7. Darkmode</w:t>
+      </w:r>
+    </w:p>
+    <w:p>
+      <w:pPr>
+        <w:ind w:firstLine="708"/>
+      </w:pPr>
+      <w:r>
+        <w:t>D7. Aantal ook in opengeklapte filter weergeven</w:t>
+      </w:r>
+    </w:p>
+    <w:p>
+      <w:pPr>
+        <w:ind w:firstLine="708"/>
+      </w:pPr>
+      <w:r>
+        <w:t>D8. Pijl naar boven en onder in de searchbar</w:t>
+      </w:r>
+    </w:p>
+    <w:p>
+      <w:pPr>
+        <w:ind w:firstLine="708"/>
+      </w:pPr>
+      <w:r>
+        <w:t>D8. Nummers van aantal nodes per status ook in uitgeklapte filter weergeven</w:t>
+      </w:r>
+    </w:p>
+    <w:p>
+      <w:pPr>
+        <w:ind w:firstLine="708"/>
+      </w:pPr>
+      <w:r>
+        <w:t>D8. Filtering van danger rating van laag naar hoog mogelijk maken</w:t>
+      </w:r>
+    </w:p>
+    <w:p>
+      <w:pPr>
+        <w:ind w:firstLine="708"/>
+        <w:rPr>
+          <w:lang w:val="en-US"/>
+        </w:rPr>
+      </w:pPr>
+      <w:r>
+        <w:rPr>
+          <w:lang w:val="en-US"/>
+        </w:rPr>
+        <w:t>D9. Enable/disalbe collapse/e</w:t>
+      </w:r>
+      <w:r>
+        <w:rPr>
+          <w:lang w:val="en-US"/>
+        </w:rPr>
+        <w:t>xpand buttons</w:t>
+      </w:r>
+    </w:p>
+    <w:p>
+      <w:pPr>
+        <w:ind w:firstLine="708"/>
+      </w:pPr>
+      <w:r>
+        <w:t>D9. Makkelijker maken van v</w:t>
+      </w:r>
+      <w:r>
+        <w:t>erwijderen van perongeluk gemaakt nodes</w:t>
+      </w:r>
+    </w:p>
+    <w:p>
+      <w:pPr>
+        <w:ind w:left="720"/>
+      </w:pPr>
     </w:p>
     <w:p>
       <w:pPr>
@@ -627,68 +3019,85 @@
     </w:p>
     <w:p>
       <w:pPr>
-        <w:numPr>
-          <w:ilvl w:val="1"/>
-          <w:numId w:val="1"/>
-        </w:numPr>
-      </w:pPr>
-      <w:r>
-        <w:t>Sortering van danger rating kunnen aanpassen</w:t>
-      </w:r>
-    </w:p>
-    <w:p>
-      <w:pPr>
-        <w:numPr>
-          <w:ilvl w:val="1"/>
-          <w:numId w:val="1"/>
-        </w:numPr>
-      </w:pPr>
-      <w:r>
-        <w:t>Button om alles te kunnen inklappen buiten de geselecteerde branch</w:t>
-      </w:r>
-    </w:p>
-    <w:p>
-      <w:pPr>
-        <w:numPr>
-          <w:ilvl w:val="1"/>
-          <w:numId w:val="1"/>
-        </w:numPr>
-      </w:pPr>
-      <w:r>
-        <w:t>Zoekbalk binnen de filtering bar</w:t>
-      </w:r>
-    </w:p>
-    <w:p>
-      <w:pPr>
-        <w:numPr>
-          <w:ilvl w:val="1"/>
-          <w:numId w:val="1"/>
-        </w:numPr>
-      </w:pPr>
-      <w:r>
-        <w:t>Elke branch een andere achtrgrondkleur geven of toch lijnen laten doorlopen. Of groeperen van blokken met een kleur en naamgeving.</w:t>
-      </w:r>
-    </w:p>
-    <w:p>
-      <w:pPr>
-        <w:numPr>
-          <w:ilvl w:val="1"/>
-          <w:numId w:val="1"/>
-        </w:numPr>
-      </w:pPr>
-      <w:r>
-        <w:t>Bij een lange branch de nodes verplaasten naar links (kijk notepad plus)</w:t>
-      </w:r>
-    </w:p>
-    <w:p>
-      <w:pPr>
-        <w:numPr>
-          <w:ilvl w:val="1"/>
-          <w:numId w:val="1"/>
-        </w:numPr>
-      </w:pPr>
-      <w:r>
-        <w:t>Inzoomen op een branch alsof dit de “nieuwe tree” wordt</w:t>
+        <w:ind w:left="720"/>
+      </w:pPr>
+      <w:r>
+        <w:t>D1. Idem als vraag 3</w:t>
+      </w:r>
+    </w:p>
+    <w:p>
+      <w:r>
+        <w:tab/>
+      </w:r>
+      <w:r>
+        <w:t xml:space="preserve">D2. Dark mode plus zie </w:t>
+      </w:r>
+      <w:r>
+        <w:t>vraag 3</w:t>
+      </w:r>
+    </w:p>
+    <w:p>
+      <w:r>
+        <w:tab/>
+        <w:t>D3. Nummer van aantal nodes bij lijst weergeven</w:t>
+      </w:r>
+    </w:p>
+    <w:p>
+      <w:r>
+        <w:tab/>
+        <w:t>D4. Nee</w:t>
+      </w:r>
+    </w:p>
+    <w:p>
+      <w:r>
+        <w:tab/>
+        <w:t>D5. Inzoomen op een subtree</w:t>
+      </w:r>
+      <w:r>
+        <w:t xml:space="preserve"> alsof het een echte tree is. Eenvoudig in complexe trees om een subdeel te editen</w:t>
+      </w:r>
+    </w:p>
+    <w:p>
+      <w:r>
+        <w:tab/>
+        <w:t>D5. Groeperen van blokjes met kleurenvakje met naam</w:t>
+      </w:r>
+    </w:p>
+    <w:p>
+      <w:r>
+        <w:tab/>
+        <w:t>D6. Bij lange branches de nodes verplaatsen naar links</w:t>
+      </w:r>
+    </w:p>
+    <w:p>
+      <w:r>
+        <w:tab/>
+        <w:t>D7. Elke branch zijn eigen colom/distinction</w:t>
+      </w:r>
+    </w:p>
+    <w:p>
+      <w:r>
+        <w:lastRenderedPageBreak/>
+        <w:tab/>
+        <w:t>D7. Lijnen in elkaar laten overlopen (als extra aanduiding buiten enkel het inspringen)</w:t>
+      </w:r>
+    </w:p>
+    <w:p>
+      <w:r>
+        <w:tab/>
+        <w:t>D8. Knop om alles te collapsen behalve geselecteerde pad</w:t>
+      </w:r>
+    </w:p>
+    <w:p>
+      <w:r>
+        <w:tab/>
+        <w:t>D8. Zoekbalk in het filter zijpaneel</w:t>
+      </w:r>
+    </w:p>
+    <w:p>
+      <w:r>
+        <w:tab/>
+        <w:t>D9. Zie vraag 3</w:t>
       </w:r>
     </w:p>
     <w:p>
@@ -709,103 +3118,101 @@
     </w:p>
     <w:p>
       <w:pPr>
-        <w:numPr>
-          <w:ilvl w:val="1"/>
-          <w:numId w:val="1"/>
-        </w:numPr>
-      </w:pPr>
-      <w:r>
-        <w:t>Versie 2: visueel aantrekkelijker, meer opties (bv. filtering en sorteren,…), beperkt de kans op het maken van fouten (bv. fortunate als child van een andere fortunate)</w:t>
-      </w:r>
-    </w:p>
-    <w:p>
-      <w:pPr>
-        <w:numPr>
-          <w:ilvl w:val="1"/>
-          <w:numId w:val="1"/>
-        </w:numPr>
-      </w:pPr>
-      <w:r>
-        <w:lastRenderedPageBreak/>
-        <w:t>Overduidelijk versie 2: overzichtelijke kleuren, quality of life functionalities (bv. statussen, auto danger level calculation, filterbar, …)</w:t>
-      </w:r>
-    </w:p>
-    <w:p>
-      <w:pPr>
-        <w:numPr>
-          <w:ilvl w:val="1"/>
-          <w:numId w:val="1"/>
-        </w:numPr>
-      </w:pPr>
-      <w:r>
-        <w:t>Versie 2: meer shortcuts en intuïtiever gebruikersgevoel met een duidelijk overzicht.</w:t>
-      </w:r>
-    </w:p>
-    <w:p>
-      <w:pPr>
-        <w:numPr>
-          <w:ilvl w:val="1"/>
-          <w:numId w:val="1"/>
-        </w:numPr>
-      </w:pPr>
-      <w:r>
-        <w:t>Versie 2: de kleuren om de gebruiker te begeleiden</w:t>
-      </w:r>
-    </w:p>
-    <w:p>
-      <w:pPr>
-        <w:numPr>
-          <w:ilvl w:val="1"/>
-          <w:numId w:val="1"/>
-        </w:numPr>
-      </w:pPr>
-      <w:r>
-        <w:t>Versie 2: banale taken als filteren, tellen, groeperen etc zijn allemaal aanwezig. Overzichtelijk door het gebruik van iconen en kleuren. Zit er visueel aantrekkelijker uit.</w:t>
-      </w:r>
-    </w:p>
-    <w:p>
-      <w:pPr>
-        <w:numPr>
-          <w:ilvl w:val="1"/>
-          <w:numId w:val="1"/>
-        </w:numPr>
-      </w:pPr>
-      <w:r>
-        <w:t>Versie 2: zoek en filter features</w:t>
-      </w:r>
-    </w:p>
-    <w:p>
-      <w:pPr>
-        <w:numPr>
-          <w:ilvl w:val="1"/>
-          <w:numId w:val="1"/>
-        </w:numPr>
-      </w:pPr>
-      <w:r>
-        <w:t>Versie 2: GUI, kleuren, automatisatie (niet zelf tellen, …), houdt je hand vast principe.</w:t>
-      </w:r>
-    </w:p>
-    <w:p>
-      <w:pPr>
-        <w:numPr>
-          <w:ilvl w:val="1"/>
-          <w:numId w:val="1"/>
-        </w:numPr>
-      </w:pPr>
-      <w:r>
-        <w:t>Versie 2: filter en sorteer features vermijden manueel tellen of zoeken.</w:t>
-      </w:r>
-    </w:p>
-    <w:p>
-      <w:pPr>
-        <w:numPr>
-          <w:ilvl w:val="1"/>
-          <w:numId w:val="1"/>
-        </w:numPr>
-      </w:pPr>
-      <w:r>
-        <w:t>Versie 2: meer funties om nodige taken uit te voeren</w:t>
-      </w:r>
+        <w:ind w:left="720"/>
+      </w:pPr>
+      <w:r>
+        <w:t>D1. Versie 2: is visueel aantrekkelijker, meer opties (bv filteren en sorteren), zorgt ervoor dat je geen foute node onder een andere kan zetten (bv 2 unfortunates onder elkaar)</w:t>
+      </w:r>
+      <w:r>
+        <w:t>.</w:t>
+      </w:r>
+    </w:p>
+    <w:p>
+      <w:pPr>
+        <w:ind w:left="720"/>
+      </w:pPr>
+      <w:r>
+        <w:t>D2. Overduidelijk versie 2: vanwege de overzichtelijke kleuren en voornamelijk de extra quality of life functions (bv. statussen, auto danger rating calculation en filterbalk)</w:t>
+      </w:r>
+      <w:r>
+        <w:t>.</w:t>
+      </w:r>
+    </w:p>
+    <w:p>
+      <w:pPr>
+        <w:ind w:left="720"/>
+      </w:pPr>
+      <w:r>
+        <w:t>D3. Versie 2: geeft veel meer shortcuts en intuïtieve gebruiksgevoel met een duidelijk overzicht</w:t>
+      </w:r>
+      <w:r>
+        <w:t>.</w:t>
+      </w:r>
+    </w:p>
+    <w:p>
+      <w:pPr>
+        <w:ind w:left="720"/>
+      </w:pPr>
+      <w:r>
+        <w:t>D4. Versie 2: er zijn kleuren aanwezig om de user te begeleiden</w:t>
+      </w:r>
+      <w:r>
+        <w:t>.</w:t>
+      </w:r>
+    </w:p>
+    <w:p>
+      <w:pPr>
+        <w:ind w:left="720"/>
+      </w:pPr>
+      <w:r>
+        <w:t>D5. Versie 2: banale taken als</w:t>
+      </w:r>
+      <w:r>
+        <w:t xml:space="preserve"> filteren, tellen, groeperen etc. zijn allemaal aanwezig. Het is overzichtelijker met icoontjes en kleuren. Ziet er ook gewoon beter uit.</w:t>
+      </w:r>
+    </w:p>
+    <w:p>
+      <w:pPr>
+        <w:ind w:left="720"/>
+      </w:pPr>
+      <w:r>
+        <w:t>D6. Versie 2: door de zoek en filter functies</w:t>
+      </w:r>
+      <w:r>
+        <w:t>.</w:t>
+      </w:r>
+    </w:p>
+    <w:p>
+      <w:pPr>
+        <w:ind w:left="720"/>
+      </w:pPr>
+      <w:r>
+        <w:t xml:space="preserve">D7. </w:t>
+      </w:r>
+      <w:r>
+        <w:t>Versie 2: kleuren, GUI, niet zelf tellen, houdt je hand vast.</w:t>
+      </w:r>
+    </w:p>
+    <w:p>
+      <w:pPr>
+        <w:ind w:left="720"/>
+      </w:pPr>
+      <w:r>
+        <w:t>D8. Versie 2: de filter en sorteer features verminderen manueel tellen of zoeken.</w:t>
+      </w:r>
+    </w:p>
+    <w:p>
+      <w:pPr>
+        <w:ind w:left="720"/>
+      </w:pPr>
+      <w:r>
+        <w:t>D9. Versie 2: veel meer hulpmiddelen om de nodige taken uit te voeren.</w:t>
+      </w:r>
+    </w:p>
+    <w:p>
+      <w:pPr>
+        <w:ind w:left="720"/>
+      </w:pPr>
     </w:p>
     <w:p>
       <w:pPr>
@@ -820,107 +3227,110 @@
     </w:p>
     <w:p>
       <w:pPr>
-        <w:numPr>
-          <w:ilvl w:val="1"/>
-          <w:numId w:val="1"/>
-        </w:numPr>
-      </w:pPr>
-      <w:r>
-        <w:t>Versie 2: bespaart tijd vermindert verwarring en ziet er beter uit.</w:t>
-      </w:r>
-    </w:p>
-    <w:p>
-      <w:pPr>
-        <w:numPr>
-          <w:ilvl w:val="1"/>
-          <w:numId w:val="1"/>
-        </w:numPr>
-      </w:pPr>
-      <w:r>
-        <w:t>Versie 2: dit is efficienter om mee te werken en visueel duidelijker.</w:t>
-      </w:r>
-    </w:p>
-    <w:p>
-      <w:pPr>
-        <w:numPr>
-          <w:ilvl w:val="1"/>
-          <w:numId w:val="1"/>
-        </w:numPr>
-      </w:pPr>
-      <w:r>
-        <w:t>Versie 2: meer userfriendly</w:t>
-      </w:r>
-    </w:p>
-    <w:p>
-      <w:pPr>
-        <w:numPr>
-          <w:ilvl w:val="1"/>
-          <w:numId w:val="1"/>
-        </w:numPr>
-      </w:pPr>
-      <w:r>
-        <w:t xml:space="preserve">Versie 2: </w:t>
-      </w:r>
-      <w:r>
-        <w:t>bevat features die het de gebruiker makkelijker maken</w:t>
-      </w:r>
-    </w:p>
-    <w:p>
-      <w:pPr>
-        <w:numPr>
-          <w:ilvl w:val="1"/>
-          <w:numId w:val="1"/>
-        </w:numPr>
-      </w:pPr>
-      <w:r>
-        <w:t>Versie 2: versie 1 zou teveel tijd kosten om de taken uit te voeren die automatisch zouden kunnen. Ook zou ik sneller fouten maken met de danger rating, status etc. zelf in te moeten geven.</w:t>
-      </w:r>
-    </w:p>
-    <w:p>
-      <w:pPr>
-        <w:numPr>
-          <w:ilvl w:val="1"/>
-          <w:numId w:val="1"/>
-        </w:numPr>
-      </w:pPr>
-      <w:r>
-        <w:t>Versie 2: oogt aantrekkelijker en is makkelijker in gebruik.</w:t>
-      </w:r>
-    </w:p>
-    <w:p>
-      <w:pPr>
-        <w:numPr>
-          <w:ilvl w:val="1"/>
-          <w:numId w:val="1"/>
-        </w:numPr>
-      </w:pPr>
-      <w:r>
-        <w:t>Versie 2: deze werkt veel sneller om alle nodige taken uit te kunnen voeren</w:t>
-      </w:r>
-    </w:p>
-    <w:p>
-      <w:pPr>
-        <w:numPr>
-          <w:ilvl w:val="1"/>
-          <w:numId w:val="1"/>
-        </w:numPr>
-      </w:pPr>
+        <w:ind w:left="720"/>
+      </w:pPr>
+      <w:r>
+        <w:t>D1.</w:t>
+      </w:r>
+      <w:r>
+        <w:t>Versie 2: idem als in vraag 5. Deze versie is duidelijker, meer functies en fool-proof.</w:t>
+      </w:r>
+    </w:p>
+    <w:p>
+      <w:pPr>
+        <w:ind w:left="720"/>
+      </w:pPr>
+      <w:r>
+        <w:t xml:space="preserve">D2. </w:t>
+      </w:r>
       <w:r>
         <w:t>Versie 2: is duidelijker, makkelijker en functioneler.</w:t>
       </w:r>
     </w:p>
     <w:p>
       <w:pPr>
-        <w:numPr>
-          <w:ilvl w:val="1"/>
-          <w:numId w:val="1"/>
-        </w:numPr>
-      </w:pPr>
-      <w:r>
-        <w:t>Versie 2: is duidelijker, meer functies en fool-proof</w:t>
-      </w:r>
-    </w:p>
-    <w:p/>
+        <w:ind w:left="720"/>
+      </w:pPr>
+      <w:r>
+        <w:t xml:space="preserve">D3. </w:t>
+      </w:r>
+      <w:r>
+        <w:t>Versie 2: omdat deze veel sneller werkt om alle taken uit te voeren.</w:t>
+      </w:r>
+    </w:p>
+    <w:p>
+      <w:pPr>
+        <w:ind w:left="720"/>
+      </w:pPr>
+      <w:r>
+        <w:t xml:space="preserve">D4. </w:t>
+      </w:r>
+      <w:r>
+        <w:t>Versie 2: oogt aantrekkelijker en is makkelijker te gebruiken.</w:t>
+      </w:r>
+    </w:p>
+    <w:p>
+      <w:pPr>
+        <w:ind w:left="720"/>
+      </w:pPr>
+      <w:r>
+        <w:lastRenderedPageBreak/>
+        <w:t xml:space="preserve">D5. </w:t>
+      </w:r>
+      <w:r>
+        <w:t>Versie 2: versie 1 zou mij te veel tijd kosten met het uitvoeren van de taken die automatisch kunnen. Ik zou ook fouten maken met danger rating, statussen, naam enz. zelf in te geven.</w:t>
+      </w:r>
+    </w:p>
+    <w:p>
+      <w:pPr>
+        <w:ind w:left="720"/>
+      </w:pPr>
+      <w:r>
+        <w:t xml:space="preserve">D6. </w:t>
+      </w:r>
+      <w:r>
+        <w:t>Versie 2: er zitten features in die het gebruiken makkelijker maken</w:t>
+      </w:r>
+    </w:p>
+    <w:p>
+      <w:pPr>
+        <w:ind w:left="720"/>
+      </w:pPr>
+      <w:r>
+        <w:t xml:space="preserve">D7.  </w:t>
+      </w:r>
+      <w:r>
+        <w:t>idem als in vraag 5. Het is gebruiksvriendelijker</w:t>
+      </w:r>
+      <w:r>
+        <w:t>.</w:t>
+      </w:r>
+    </w:p>
+    <w:p>
+      <w:pPr>
+        <w:ind w:left="720"/>
+      </w:pPr>
+      <w:r>
+        <w:t xml:space="preserve">D8. </w:t>
+      </w:r>
+      <w:r>
+        <w:t>Versie 2: deze is efficiënter om mee te werken en is ook visueel duidelijker</w:t>
+      </w:r>
+    </w:p>
+    <w:p>
+      <w:pPr>
+        <w:ind w:left="720"/>
+      </w:pPr>
+      <w:r>
+        <w:t>D9.</w:t>
+      </w:r>
+      <w:r>
+        <w:t xml:space="preserve"> </w:t>
+      </w:r>
+      <w:r>
+        <w:t>Versie 2: bespaart tijd en vermindert verwarring</w:t>
+      </w:r>
+    </w:p>
     <w:sectPr>
       <w:pgSz w:w="11906" w:h="16838"/>
       <w:pgMar w:top="1417" w:right="1417" w:bottom="1417" w:left="1417" w:header="708" w:footer="708" w:gutter="0"/>
@@ -952,7 +3362,7 @@
       <w:lvlText w:val="%2."/>
       <w:lvlJc w:val="left"/>
       <w:pPr>
-        <w:ind w:left="1440" w:hanging="360"/>
+        <w:ind w:left="1494" w:hanging="360"/>
       </w:pPr>
     </w:lvl>
     <w:lvl w:ilvl="2" w:tplc="0813001B">
@@ -2443,6 +4853,25 @@
       <w:spacing w:val="5"/>
     </w:rPr>
   </w:style>
+  <w:style w:type="table" w:styleId="Tabelraster">
+    <w:name w:val="Table Grid"/>
+    <w:basedOn w:val="Standaardtabel"/>
+    <w:uiPriority w:val="39"/>
+    <w:rsid w:val="000D233C"/>
+    <w:pPr>
+      <w:spacing w:after="0" w:line="240" w:lineRule="auto"/>
+    </w:pPr>
+    <w:tblPr>
+      <w:tblBorders>
+        <w:top w:val="single" w:sz="4" w:space="0" w:color="auto"/>
+        <w:left w:val="single" w:sz="4" w:space="0" w:color="auto"/>
+        <w:bottom w:val="single" w:sz="4" w:space="0" w:color="auto"/>
+        <w:right w:val="single" w:sz="4" w:space="0" w:color="auto"/>
+        <w:insideH w:val="single" w:sz="4" w:space="0" w:color="auto"/>
+        <w:insideV w:val="single" w:sz="4" w:space="0" w:color="auto"/>
+      </w:tblBorders>
+    </w:tblPr>
+  </w:style>
 </w:styles>
 </file>
 

</xml_diff>

<commit_message>
added feature ranking excel and text in paper
</commit_message>
<xml_diff>
--- a/Open_Question_Answers.docx
+++ b/Open_Question_Answers.docx
@@ -73,17 +73,8 @@
                 <w:sz w:val="18"/>
                 <w:szCs w:val="18"/>
               </w:rPr>
-              <w:t xml:space="preserve">Toon </w:t>
-            </w:r>
-            <w:proofErr w:type="spellStart"/>
-            <w:r>
-              <w:rPr>
-                <w:sz w:val="18"/>
-                <w:szCs w:val="18"/>
-              </w:rPr>
-              <w:t>Lehembre</w:t>
-            </w:r>
-            <w:proofErr w:type="spellEnd"/>
+              <w:t>Toon Lehembre</w:t>
+            </w:r>
           </w:p>
         </w:tc>
         <w:tc>
@@ -182,17 +173,8 @@
                 <w:sz w:val="18"/>
                 <w:szCs w:val="18"/>
               </w:rPr>
-              <w:t xml:space="preserve">Software </w:t>
-            </w:r>
-            <w:proofErr w:type="spellStart"/>
-            <w:r>
-              <w:rPr>
-                <w:sz w:val="18"/>
-                <w:szCs w:val="18"/>
-              </w:rPr>
-              <w:t>developer</w:t>
-            </w:r>
-            <w:proofErr w:type="spellEnd"/>
+              <w:t>Software developer</w:t>
+            </w:r>
           </w:p>
         </w:tc>
       </w:tr>
@@ -233,17 +215,8 @@
                 <w:sz w:val="18"/>
                 <w:szCs w:val="18"/>
               </w:rPr>
-              <w:t xml:space="preserve">Frank </w:t>
-            </w:r>
-            <w:proofErr w:type="spellStart"/>
-            <w:r>
-              <w:rPr>
-                <w:sz w:val="18"/>
-                <w:szCs w:val="18"/>
-              </w:rPr>
-              <w:t>Lieberwirth</w:t>
-            </w:r>
-            <w:proofErr w:type="spellEnd"/>
+              <w:t>Frank Lieberwirth</w:t>
+            </w:r>
           </w:p>
         </w:tc>
         <w:tc>
@@ -322,49 +295,8 @@
                 <w:sz w:val="18"/>
                 <w:szCs w:val="18"/>
               </w:rPr>
-              <w:t>Nee, inbegrepen in opleiding en non-</w:t>
-            </w:r>
-            <w:proofErr w:type="spellStart"/>
-            <w:r>
-              <w:rPr>
-                <w:sz w:val="18"/>
-                <w:szCs w:val="18"/>
-              </w:rPr>
-              <w:t>functional</w:t>
-            </w:r>
-            <w:proofErr w:type="spellEnd"/>
-            <w:r>
-              <w:rPr>
-                <w:sz w:val="18"/>
-                <w:szCs w:val="18"/>
-              </w:rPr>
-              <w:t xml:space="preserve"> </w:t>
-            </w:r>
-            <w:proofErr w:type="spellStart"/>
-            <w:r>
-              <w:rPr>
-                <w:sz w:val="18"/>
-                <w:szCs w:val="18"/>
-              </w:rPr>
-              <w:t>secrutiry</w:t>
-            </w:r>
-            <w:proofErr w:type="spellEnd"/>
-            <w:r>
-              <w:rPr>
-                <w:sz w:val="18"/>
-                <w:szCs w:val="18"/>
-              </w:rPr>
-              <w:t xml:space="preserve"> </w:t>
-            </w:r>
-            <w:proofErr w:type="spellStart"/>
-            <w:r>
-              <w:rPr>
-                <w:sz w:val="18"/>
-                <w:szCs w:val="18"/>
-              </w:rPr>
-              <w:t>requirements</w:t>
-            </w:r>
-            <w:proofErr w:type="spellEnd"/>
+              <w:t>Nee, inbegrepen in opleiding en non-functional secrutiry requirements</w:t>
+            </w:r>
           </w:p>
         </w:tc>
         <w:tc>
@@ -383,33 +315,8 @@
                 <w:sz w:val="18"/>
                 <w:szCs w:val="18"/>
               </w:rPr>
-              <w:t xml:space="preserve">Scrum master &amp; </w:t>
-            </w:r>
-            <w:proofErr w:type="spellStart"/>
-            <w:r>
-              <w:rPr>
-                <w:sz w:val="18"/>
-                <w:szCs w:val="18"/>
-              </w:rPr>
-              <w:t>functional</w:t>
-            </w:r>
-            <w:proofErr w:type="spellEnd"/>
-            <w:r>
-              <w:rPr>
-                <w:sz w:val="18"/>
-                <w:szCs w:val="18"/>
-              </w:rPr>
-              <w:t xml:space="preserve"> </w:t>
-            </w:r>
-            <w:proofErr w:type="spellStart"/>
-            <w:r>
-              <w:rPr>
-                <w:sz w:val="18"/>
-                <w:szCs w:val="18"/>
-              </w:rPr>
-              <w:t>analyst</w:t>
-            </w:r>
-            <w:proofErr w:type="spellEnd"/>
+              <w:t>Scrum master &amp; functional analyst</w:t>
+            </w:r>
           </w:p>
         </w:tc>
       </w:tr>
@@ -450,17 +357,8 @@
                 <w:sz w:val="18"/>
                 <w:szCs w:val="18"/>
               </w:rPr>
-              <w:t xml:space="preserve">Jef </w:t>
-            </w:r>
-            <w:proofErr w:type="spellStart"/>
-            <w:r>
-              <w:rPr>
-                <w:sz w:val="18"/>
-                <w:szCs w:val="18"/>
-              </w:rPr>
-              <w:t>Dello</w:t>
-            </w:r>
-            <w:proofErr w:type="spellEnd"/>
+              <w:t>Jef Dello</w:t>
+            </w:r>
           </w:p>
         </w:tc>
         <w:tc>
@@ -541,87 +439,15 @@
                 <w:szCs w:val="18"/>
                 <w:lang w:val="en-US"/>
               </w:rPr>
-              <w:t xml:space="preserve">Nee, security courses </w:t>
-            </w:r>
-            <w:proofErr w:type="spellStart"/>
+              <w:t>Nee, security courses uhass</w:t>
+            </w:r>
             <w:r>
               <w:rPr>
                 <w:sz w:val="18"/>
                 <w:szCs w:val="18"/>
                 <w:lang w:val="en-US"/>
               </w:rPr>
-              <w:t>uhass</w:t>
-            </w:r>
-            <w:r>
-              <w:rPr>
-                <w:sz w:val="18"/>
-                <w:szCs w:val="18"/>
-                <w:lang w:val="en-US"/>
-              </w:rPr>
-              <w:t>elt</w:t>
-            </w:r>
-            <w:proofErr w:type="spellEnd"/>
-            <w:r>
-              <w:rPr>
-                <w:sz w:val="18"/>
-                <w:szCs w:val="18"/>
-                <w:lang w:val="en-US"/>
-              </w:rPr>
-              <w:t xml:space="preserve"> </w:t>
-            </w:r>
-            <w:proofErr w:type="spellStart"/>
-            <w:r>
-              <w:rPr>
-                <w:sz w:val="18"/>
-                <w:szCs w:val="18"/>
-                <w:lang w:val="en-US"/>
-              </w:rPr>
-              <w:t>en</w:t>
-            </w:r>
-            <w:proofErr w:type="spellEnd"/>
-            <w:r>
-              <w:rPr>
-                <w:sz w:val="18"/>
-                <w:szCs w:val="18"/>
-                <w:lang w:val="en-US"/>
-              </w:rPr>
-              <w:t xml:space="preserve"> </w:t>
-            </w:r>
-            <w:proofErr w:type="spellStart"/>
-            <w:r>
-              <w:rPr>
-                <w:sz w:val="18"/>
-                <w:szCs w:val="18"/>
-                <w:lang w:val="en-US"/>
-              </w:rPr>
-              <w:t>pxl</w:t>
-            </w:r>
-            <w:proofErr w:type="spellEnd"/>
-            <w:r>
-              <w:rPr>
-                <w:sz w:val="18"/>
-                <w:szCs w:val="18"/>
-                <w:lang w:val="en-US"/>
-              </w:rPr>
-              <w:t xml:space="preserve"> </w:t>
-            </w:r>
-            <w:proofErr w:type="spellStart"/>
-            <w:r>
-              <w:rPr>
-                <w:sz w:val="18"/>
-                <w:szCs w:val="18"/>
-                <w:lang w:val="en-US"/>
-              </w:rPr>
-              <w:t>en</w:t>
-            </w:r>
-            <w:proofErr w:type="spellEnd"/>
-            <w:r>
-              <w:rPr>
-                <w:sz w:val="18"/>
-                <w:szCs w:val="18"/>
-                <w:lang w:val="en-US"/>
-              </w:rPr>
-              <w:t xml:space="preserve"> cybersecurity challenge</w:t>
+              <w:t>elt en pxl en cybersecurity challenge</w:t>
             </w:r>
           </w:p>
         </w:tc>
@@ -685,17 +511,8 @@
                 <w:sz w:val="18"/>
                 <w:szCs w:val="18"/>
               </w:rPr>
-              <w:t xml:space="preserve">Abdullah </w:t>
-            </w:r>
-            <w:proofErr w:type="spellStart"/>
-            <w:r>
-              <w:rPr>
-                <w:sz w:val="18"/>
-                <w:szCs w:val="18"/>
-              </w:rPr>
-              <w:t>Yalvac</w:t>
-            </w:r>
-            <w:proofErr w:type="spellEnd"/>
+              <w:t>Abdullah Yalvac</w:t>
+            </w:r>
           </w:p>
         </w:tc>
         <w:tc>
@@ -729,21 +546,12 @@
                 <w:szCs w:val="18"/>
               </w:rPr>
             </w:pPr>
-            <w:proofErr w:type="spellStart"/>
-            <w:r>
-              <w:rPr>
-                <w:sz w:val="18"/>
-                <w:szCs w:val="18"/>
-              </w:rPr>
-              <w:t>Industiële</w:t>
-            </w:r>
-            <w:proofErr w:type="spellEnd"/>
-            <w:r>
-              <w:rPr>
-                <w:sz w:val="18"/>
-                <w:szCs w:val="18"/>
-              </w:rPr>
-              <w:t xml:space="preserve"> wetenschappen informatica</w:t>
+            <w:r>
+              <w:rPr>
+                <w:sz w:val="18"/>
+                <w:szCs w:val="18"/>
+              </w:rPr>
+              <w:t>Industiële wetenschappen informatica</w:t>
             </w:r>
           </w:p>
         </w:tc>
@@ -1027,17 +835,8 @@
                 <w:sz w:val="18"/>
                 <w:szCs w:val="18"/>
               </w:rPr>
-              <w:t xml:space="preserve">Toegepaste IT – AI &amp; </w:t>
-            </w:r>
-            <w:proofErr w:type="spellStart"/>
-            <w:r>
-              <w:rPr>
-                <w:sz w:val="18"/>
-                <w:szCs w:val="18"/>
-              </w:rPr>
-              <w:t>Robotics</w:t>
-            </w:r>
-            <w:proofErr w:type="spellEnd"/>
+              <w:t>Toegepaste IT – AI &amp; Robotics</w:t>
+            </w:r>
           </w:p>
         </w:tc>
         <w:tc>
@@ -1096,17 +895,8 @@
                 <w:sz w:val="18"/>
                 <w:szCs w:val="18"/>
               </w:rPr>
-              <w:t xml:space="preserve">.Net software </w:t>
-            </w:r>
-            <w:proofErr w:type="spellStart"/>
-            <w:r>
-              <w:rPr>
-                <w:sz w:val="18"/>
-                <w:szCs w:val="18"/>
-              </w:rPr>
-              <w:t>developer</w:t>
-            </w:r>
-            <w:proofErr w:type="spellEnd"/>
+              <w:t>.Net software developer</w:t>
+            </w:r>
           </w:p>
         </w:tc>
       </w:tr>
@@ -1147,17 +937,8 @@
                 <w:sz w:val="18"/>
                 <w:szCs w:val="18"/>
               </w:rPr>
-              <w:t xml:space="preserve">Robbe </w:t>
-            </w:r>
-            <w:proofErr w:type="spellStart"/>
-            <w:r>
-              <w:rPr>
-                <w:sz w:val="18"/>
-                <w:szCs w:val="18"/>
-              </w:rPr>
-              <w:t>Caenen</w:t>
-            </w:r>
-            <w:proofErr w:type="spellEnd"/>
+              <w:t>Robbe Caenen</w:t>
+            </w:r>
           </w:p>
         </w:tc>
         <w:tc>
@@ -1256,17 +1037,8 @@
                 <w:sz w:val="18"/>
                 <w:szCs w:val="18"/>
               </w:rPr>
-              <w:t xml:space="preserve">Junior software </w:t>
-            </w:r>
-            <w:proofErr w:type="spellStart"/>
-            <w:r>
-              <w:rPr>
-                <w:sz w:val="18"/>
-                <w:szCs w:val="18"/>
-              </w:rPr>
-              <w:t>developer</w:t>
-            </w:r>
-            <w:proofErr w:type="spellEnd"/>
+              <w:t>Junior software developer</w:t>
+            </w:r>
           </w:p>
         </w:tc>
       </w:tr>
@@ -1307,17 +1079,8 @@
                 <w:sz w:val="18"/>
                 <w:szCs w:val="18"/>
               </w:rPr>
-              <w:t xml:space="preserve">Ebbe </w:t>
-            </w:r>
-            <w:proofErr w:type="spellStart"/>
-            <w:r>
-              <w:rPr>
-                <w:sz w:val="18"/>
-                <w:szCs w:val="18"/>
-              </w:rPr>
-              <w:t>Wertz</w:t>
-            </w:r>
-            <w:proofErr w:type="spellEnd"/>
+              <w:t>Ebbe Wertz</w:t>
+            </w:r>
           </w:p>
         </w:tc>
         <w:tc>
@@ -1356,17 +1119,8 @@
                 <w:sz w:val="18"/>
                 <w:szCs w:val="18"/>
               </w:rPr>
-              <w:t xml:space="preserve">IIW-master </w:t>
-            </w:r>
-            <w:proofErr w:type="spellStart"/>
-            <w:r>
-              <w:rPr>
-                <w:sz w:val="18"/>
-                <w:szCs w:val="18"/>
-              </w:rPr>
-              <w:t>infortmatica</w:t>
-            </w:r>
-            <w:proofErr w:type="spellEnd"/>
+              <w:t>IIW-master infortmatica</w:t>
+            </w:r>
           </w:p>
         </w:tc>
         <w:tc>
@@ -1462,31 +1216,13 @@
                 <w:szCs w:val="18"/>
               </w:rPr>
             </w:pPr>
-            <w:proofErr w:type="spellStart"/>
-            <w:r>
-              <w:rPr>
-                <w:sz w:val="18"/>
-                <w:szCs w:val="18"/>
-              </w:rPr>
-              <w:t>Jenthe</w:t>
-            </w:r>
-            <w:proofErr w:type="spellEnd"/>
-            <w:r>
-              <w:rPr>
-                <w:sz w:val="18"/>
-                <w:szCs w:val="18"/>
-              </w:rPr>
-              <w:t xml:space="preserve"> </w:t>
-            </w:r>
-            <w:proofErr w:type="spellStart"/>
-            <w:r>
-              <w:rPr>
-                <w:sz w:val="18"/>
-                <w:szCs w:val="18"/>
-              </w:rPr>
-              <w:t>Lowist</w:t>
-            </w:r>
-            <w:proofErr w:type="spellEnd"/>
+            <w:r>
+              <w:rPr>
+                <w:sz w:val="18"/>
+                <w:szCs w:val="18"/>
+              </w:rPr>
+              <w:t>Jenthe Lowist</w:t>
+            </w:r>
           </w:p>
         </w:tc>
         <w:tc>
@@ -1656,35 +1392,7 @@
         <w:rPr>
           <w:lang w:val="en-US"/>
         </w:rPr>
-        <w:t xml:space="preserve">Was de Fortunately-Unfortunately </w:t>
-      </w:r>
-      <w:proofErr w:type="spellStart"/>
-      <w:r>
-        <w:rPr>
-          <w:lang w:val="en-US"/>
-        </w:rPr>
-        <w:t>methode</w:t>
-      </w:r>
-      <w:proofErr w:type="spellEnd"/>
-      <w:r>
-        <w:rPr>
-          <w:lang w:val="en-US"/>
-        </w:rPr>
-        <w:t xml:space="preserve"> </w:t>
-      </w:r>
-      <w:proofErr w:type="spellStart"/>
-      <w:r>
-        <w:rPr>
-          <w:lang w:val="en-US"/>
-        </w:rPr>
-        <w:t>duidelijk</w:t>
-      </w:r>
-      <w:proofErr w:type="spellEnd"/>
-      <w:r>
-        <w:rPr>
-          <w:lang w:val="en-US"/>
-        </w:rPr>
-        <w:t>?</w:t>
+        <w:t>Was de Fortunately-Unfortunately methode duidelijk?</w:t>
       </w:r>
     </w:p>
     <w:p>
@@ -2470,15 +2178,7 @@
           </w:tcPr>
           <w:p>
             <w:r>
-              <w:t xml:space="preserve">Notitie van aantal </w:t>
-            </w:r>
-            <w:proofErr w:type="spellStart"/>
-            <w:r>
-              <w:t>nodes</w:t>
-            </w:r>
-            <w:proofErr w:type="spellEnd"/>
-            <w:r>
-              <w:t xml:space="preserve"> per bepaalde status</w:t>
+              <w:t>Notitie van aantal nodes per bepaalde status</w:t>
             </w:r>
           </w:p>
         </w:tc>
@@ -2610,15 +2310,7 @@
           </w:tcPr>
           <w:p>
             <w:r>
-              <w:t xml:space="preserve">Rangschikking op basis van </w:t>
-            </w:r>
-            <w:proofErr w:type="spellStart"/>
-            <w:r>
-              <w:t>danger</w:t>
-            </w:r>
-            <w:proofErr w:type="spellEnd"/>
-            <w:r>
-              <w:t xml:space="preserve"> rating binnen de filtering</w:t>
+              <w:t>Rangschikking op basis van danger rating binnen de filtering</w:t>
             </w:r>
           </w:p>
         </w:tc>
@@ -3014,13 +2706,8 @@
           </w:tcPr>
           <w:p>
             <w:r>
-              <w:t xml:space="preserve">Tooltips bij </w:t>
-            </w:r>
-            <w:proofErr w:type="spellStart"/>
-            <w:r>
-              <w:t>hoveren</w:t>
-            </w:r>
-            <w:proofErr w:type="spellEnd"/>
+              <w:t>Tooltips bij hoveren</w:t>
+            </w:r>
           </w:p>
         </w:tc>
         <w:tc>
@@ -3179,15 +2866,7 @@
         <w:t xml:space="preserve">D1. </w:t>
       </w:r>
       <w:r>
-        <w:t xml:space="preserve">Manier om </w:t>
-      </w:r>
-      <w:proofErr w:type="spellStart"/>
-      <w:r>
-        <w:t>nodes</w:t>
-      </w:r>
-      <w:proofErr w:type="spellEnd"/>
-      <w:r>
-        <w:t xml:space="preserve"> dicht te klappen</w:t>
+        <w:t>Manier om nodes dicht te klappen</w:t>
       </w:r>
     </w:p>
     <w:p>
@@ -3214,15 +2893,7 @@
         <w:ind w:firstLine="708"/>
       </w:pPr>
       <w:r>
-        <w:t xml:space="preserve">D3. Knop om </w:t>
-      </w:r>
-      <w:proofErr w:type="spellStart"/>
-      <w:r>
-        <w:t>children</w:t>
-      </w:r>
-      <w:proofErr w:type="spellEnd"/>
-      <w:r>
-        <w:t xml:space="preserve"> van een node dicht te klappen</w:t>
+        <w:t>D3. Knop om children van een node dicht te klappen</w:t>
       </w:r>
     </w:p>
     <w:p>
@@ -3238,15 +2909,7 @@
         <w:ind w:firstLine="708"/>
       </w:pPr>
       <w:r>
-        <w:t xml:space="preserve">D5. </w:t>
-      </w:r>
-      <w:proofErr w:type="spellStart"/>
-      <w:r>
-        <w:t>Custom</w:t>
-      </w:r>
-      <w:proofErr w:type="spellEnd"/>
-      <w:r>
-        <w:t xml:space="preserve"> statussen mogelijk maken</w:t>
+        <w:t>D5. Custom statussen mogelijk maken</w:t>
       </w:r>
     </w:p>
     <w:p>
@@ -3260,15 +2923,7 @@
         <w:t xml:space="preserve">Info button beweegt </w:t>
       </w:r>
       <w:r>
-        <w:t xml:space="preserve">na </w:t>
-      </w:r>
-      <w:proofErr w:type="spellStart"/>
-      <w:r>
-        <w:t>hover</w:t>
-      </w:r>
-      <w:proofErr w:type="spellEnd"/>
-      <w:r>
-        <w:t>)</w:t>
+        <w:t>na hover)</w:t>
       </w:r>
     </w:p>
     <w:p>
@@ -3300,15 +2955,7 @@
         <w:ind w:firstLine="708"/>
       </w:pPr>
       <w:r>
-        <w:t xml:space="preserve">D8. Nummers van aantal </w:t>
-      </w:r>
-      <w:proofErr w:type="spellStart"/>
-      <w:r>
-        <w:t>nodes</w:t>
-      </w:r>
-      <w:proofErr w:type="spellEnd"/>
-      <w:r>
-        <w:t xml:space="preserve"> per status ook in uitgeklapte filter weergeven</w:t>
+        <w:t>D8. Nummers van aantal nodes per status ook in uitgeklapte filter weergeven</w:t>
       </w:r>
     </w:p>
     <w:p>
@@ -3316,15 +2963,7 @@
         <w:ind w:firstLine="708"/>
       </w:pPr>
       <w:r>
-        <w:t xml:space="preserve">D8. Filtering van </w:t>
-      </w:r>
-      <w:proofErr w:type="spellStart"/>
-      <w:r>
-        <w:t>danger</w:t>
-      </w:r>
-      <w:proofErr w:type="spellEnd"/>
-      <w:r>
-        <w:t xml:space="preserve"> rating van laag naar hoog mogelijk maken</w:t>
+        <w:t>D8. Filtering van danger rating van laag naar hoog mogelijk maken</w:t>
       </w:r>
     </w:p>
     <w:p>
@@ -3338,21 +2977,7 @@
         <w:rPr>
           <w:lang w:val="en-US"/>
         </w:rPr>
-        <w:t>D9. Enable/</w:t>
-      </w:r>
-      <w:proofErr w:type="spellStart"/>
-      <w:r>
-        <w:rPr>
-          <w:lang w:val="en-US"/>
-        </w:rPr>
-        <w:t>disalbe</w:t>
-      </w:r>
-      <w:proofErr w:type="spellEnd"/>
-      <w:r>
-        <w:rPr>
-          <w:lang w:val="en-US"/>
-        </w:rPr>
-        <w:t xml:space="preserve"> collapse/e</w:t>
+        <w:t>D9. Enable/disalbe collapse/e</w:t>
       </w:r>
       <w:r>
         <w:rPr>
@@ -3369,21 +2994,8 @@
         <w:t>D9. Makkelijker maken van v</w:t>
       </w:r>
       <w:r>
-        <w:t xml:space="preserve">erwijderen van </w:t>
-      </w:r>
-      <w:proofErr w:type="spellStart"/>
-      <w:r>
-        <w:t>perongeluk</w:t>
-      </w:r>
-      <w:proofErr w:type="spellEnd"/>
-      <w:r>
-        <w:t xml:space="preserve"> gemaakt </w:t>
-      </w:r>
-      <w:proofErr w:type="spellStart"/>
-      <w:r>
-        <w:t>nodes</w:t>
-      </w:r>
-      <w:proofErr w:type="spellEnd"/>
+        <w:t>erwijderen van perongeluk gemaakt nodes</w:t>
+      </w:r>
     </w:p>
     <w:p>
       <w:pPr>
@@ -3398,15 +3010,7 @@
         </w:numPr>
       </w:pPr>
       <w:r>
-        <w:t xml:space="preserve">Heb je suggesties om features op een andere manier aan te pakken of een feature die nog nuttig kan zijn om de user </w:t>
-      </w:r>
-      <w:proofErr w:type="spellStart"/>
-      <w:r>
-        <w:t>experience</w:t>
-      </w:r>
-      <w:proofErr w:type="spellEnd"/>
-      <w:r>
-        <w:t xml:space="preserve"> te verbeteren?</w:t>
+        <w:t>Heb je suggesties om features op een andere manier aan te pakken of een feature die nog nuttig kan zijn om de user experience te verbeteren?</w:t>
       </w:r>
     </w:p>
     <w:p>
@@ -3431,15 +3035,7 @@
     <w:p>
       <w:r>
         <w:tab/>
-        <w:t xml:space="preserve">D3. Nummer van aantal </w:t>
-      </w:r>
-      <w:proofErr w:type="spellStart"/>
-      <w:r>
-        <w:t>nodes</w:t>
-      </w:r>
-      <w:proofErr w:type="spellEnd"/>
-      <w:r>
-        <w:t xml:space="preserve"> bij lijst weergeven</w:t>
+        <w:t>D3. Nummer van aantal nodes bij lijst weergeven</w:t>
       </w:r>
     </w:p>
     <w:p>
@@ -3451,23 +3047,10 @@
     <w:p>
       <w:r>
         <w:tab/>
-        <w:t xml:space="preserve">D5. Inzoomen op een </w:t>
-      </w:r>
-      <w:proofErr w:type="spellStart"/>
-      <w:r>
-        <w:t>subtree</w:t>
-      </w:r>
-      <w:proofErr w:type="spellEnd"/>
-      <w:r>
-        <w:t xml:space="preserve"> alsof het een echte tree is. Eenvoudig in complexe trees om een </w:t>
-      </w:r>
-      <w:proofErr w:type="spellStart"/>
-      <w:r>
-        <w:t>subdeel</w:t>
-      </w:r>
-      <w:proofErr w:type="spellEnd"/>
-      <w:r>
-        <w:t xml:space="preserve"> te editen</w:t>
+        <w:t>D5. Inzoomen op een subtree</w:t>
+      </w:r>
+      <w:r>
+        <w:t xml:space="preserve"> alsof het een echte tree is. Eenvoudig in complexe trees om een subdeel te editen</w:t>
       </w:r>
     </w:p>
     <w:p>
@@ -3479,43 +3062,14 @@
     <w:p>
       <w:r>
         <w:tab/>
-        <w:t xml:space="preserve">D6. Bij lange branches de </w:t>
-      </w:r>
-      <w:proofErr w:type="spellStart"/>
-      <w:r>
-        <w:t>nodes</w:t>
-      </w:r>
-      <w:proofErr w:type="spellEnd"/>
-      <w:r>
-        <w:t xml:space="preserve"> verplaatsen naar links</w:t>
+        <w:t>D6. Bij lange branches de nodes verplaatsen naar links</w:t>
       </w:r>
     </w:p>
     <w:p>
       <w:r>
         <w:tab/>
-        <w:t xml:space="preserve">D7. Elke </w:t>
-      </w:r>
-      <w:proofErr w:type="spellStart"/>
-      <w:r>
-        <w:t>branch</w:t>
-      </w:r>
-      <w:proofErr w:type="spellEnd"/>
-      <w:r>
-        <w:t xml:space="preserve"> zijn eigen </w:t>
-      </w:r>
-      <w:proofErr w:type="spellStart"/>
-      <w:r>
-        <w:t>colom</w:t>
-      </w:r>
-      <w:proofErr w:type="spellEnd"/>
-      <w:r>
-        <w:t>/</w:t>
-      </w:r>
-      <w:proofErr w:type="spellStart"/>
-      <w:r>
-        <w:t>distinction</w:t>
-      </w:r>
-      <w:proofErr w:type="spellEnd"/>
+        <w:t>D7. Elke branch zijn eigen colom/distinction</w:t>
+      </w:r>
     </w:p>
     <w:p>
       <w:r>
@@ -3563,15 +3117,7 @@
         <w:ind w:left="720"/>
       </w:pPr>
       <w:r>
-        <w:t xml:space="preserve">D1. Versie 2: is visueel aantrekkelijker, meer opties (bv filteren en sorteren), zorgt ervoor dat je geen foute node onder een andere kan zetten (bv 2 </w:t>
-      </w:r>
-      <w:proofErr w:type="spellStart"/>
-      <w:r>
-        <w:t>unfortunates</w:t>
-      </w:r>
-      <w:proofErr w:type="spellEnd"/>
-      <w:r>
-        <w:t xml:space="preserve"> onder elkaar)</w:t>
+        <w:t>D1. Versie 2: is visueel aantrekkelijker, meer opties (bv filteren en sorteren), zorgt ervoor dat je geen foute node onder een andere kan zetten (bv 2 unfortunates onder elkaar)</w:t>
       </w:r>
       <w:r>
         <w:t>.</w:t>
@@ -3582,39 +3128,7 @@
         <w:ind w:left="720"/>
       </w:pPr>
       <w:r>
-        <w:t xml:space="preserve">D2. Overduidelijk versie 2: vanwege de overzichtelijke kleuren en voornamelijk de extra </w:t>
-      </w:r>
-      <w:proofErr w:type="spellStart"/>
-      <w:r>
-        <w:t>quality</w:t>
-      </w:r>
-      <w:proofErr w:type="spellEnd"/>
-      <w:r>
-        <w:t xml:space="preserve"> of life </w:t>
-      </w:r>
-      <w:proofErr w:type="spellStart"/>
-      <w:r>
-        <w:t>functions</w:t>
-      </w:r>
-      <w:proofErr w:type="spellEnd"/>
-      <w:r>
-        <w:t xml:space="preserve"> (bv. statussen, auto </w:t>
-      </w:r>
-      <w:proofErr w:type="spellStart"/>
-      <w:r>
-        <w:t>danger</w:t>
-      </w:r>
-      <w:proofErr w:type="spellEnd"/>
-      <w:r>
-        <w:t xml:space="preserve"> rating </w:t>
-      </w:r>
-      <w:proofErr w:type="spellStart"/>
-      <w:r>
-        <w:t>calculation</w:t>
-      </w:r>
-      <w:proofErr w:type="spellEnd"/>
-      <w:r>
-        <w:t xml:space="preserve"> en filterbalk)</w:t>
+        <w:t>D2. Overduidelijk versie 2: vanwege de overzichtelijke kleuren en voornamelijk de extra quality of life functions (bv. statussen, auto danger rating calculation en filterbalk)</w:t>
       </w:r>
       <w:r>
         <w:t>.</w:t>
@@ -3712,15 +3226,7 @@
         <w:ind w:left="720"/>
       </w:pPr>
       <w:r>
-        <w:t>D1.Versie 2: idem als in vraag 5. Deze versie is duidelijker, meer functies en fool-</w:t>
-      </w:r>
-      <w:proofErr w:type="spellStart"/>
-      <w:r>
-        <w:t>proof</w:t>
-      </w:r>
-      <w:proofErr w:type="spellEnd"/>
-      <w:r>
-        <w:t>.</w:t>
+        <w:t>D1.Versie 2: idem als in vraag 5. Deze versie is duidelijker, meer functies en fool-proof.</w:t>
       </w:r>
     </w:p>
     <w:p>
@@ -3753,15 +3259,7 @@
       </w:pPr>
       <w:r>
         <w:lastRenderedPageBreak/>
-        <w:t xml:space="preserve">D5. Versie 2: versie 1 zou mij te veel tijd kosten met het uitvoeren van de taken die automatisch kunnen. Ik zou ook fouten maken met </w:t>
-      </w:r>
-      <w:proofErr w:type="spellStart"/>
-      <w:r>
-        <w:t>danger</w:t>
-      </w:r>
-      <w:proofErr w:type="spellEnd"/>
-      <w:r>
-        <w:t xml:space="preserve"> rating, statussen, naam enz. zelf in te geven.</w:t>
+        <w:t>D5. Versie 2: versie 1 zou mij te veel tijd kosten met het uitvoeren van de taken die automatisch kunnen. Ik zou ook fouten maken met danger rating, statussen, naam enz. zelf in te geven.</w:t>
       </w:r>
     </w:p>
     <w:p>

</xml_diff>